<commit_message>
templates and interview complete
</commit_message>
<xml_diff>
--- a/docassemble/MinorGuardianshipDischarge/data/templates/guardianship_discharge_order.docx
+++ b/docassemble/MinorGuardianshipDischarge/data/templates/guardianship_discharge_order.docx
@@ -124,7 +124,25 @@
           <w:sz w:val="24"/>
           <w:szCs w:val="24"/>
         </w:rPr>
-        <w:t>{{ judicial_district_ordinal()}}</w:t>
+        <w:t>{{ judicial_district_ordinal</w:t>
+      </w:r>
+      <w:r>
+        <w:rPr>
+          <w:rFonts w:ascii="Times New Roman" w:hAnsi="Times New Roman"/>
+          <w:b/>
+          <w:sz w:val="24"/>
+          <w:szCs w:val="24"/>
+        </w:rPr>
+        <w:t>.upper</w:t>
+      </w:r>
+      <w:r>
+        <w:rPr>
+          <w:rFonts w:ascii="Times New Roman" w:hAnsi="Times New Roman"/>
+          <w:b/>
+          <w:sz w:val="24"/>
+          <w:szCs w:val="24"/>
+        </w:rPr>
+        <w:t>()}}</w:t>
       </w:r>
       <w:r>
         <w:rPr>
@@ -155,7 +173,25 @@
           <w:sz w:val="24"/>
           <w:szCs w:val="24"/>
         </w:rPr>
-        <w:t>{{trial_court.address.county}}</w:t>
+        <w:t>{{trial_court.address.county</w:t>
+      </w:r>
+      <w:r>
+        <w:rPr>
+          <w:rFonts w:ascii="Times New Roman" w:hAnsi="Times New Roman"/>
+          <w:b/>
+          <w:sz w:val="24"/>
+          <w:szCs w:val="24"/>
+        </w:rPr>
+        <w:t>.upper()</w:t>
+      </w:r>
+      <w:r>
+        <w:rPr>
+          <w:rFonts w:ascii="Times New Roman" w:hAnsi="Times New Roman"/>
+          <w:b/>
+          <w:sz w:val="24"/>
+          <w:szCs w:val="24"/>
+        </w:rPr>
+        <w:t>}}</w:t>
       </w:r>
       <w:r>
         <w:rPr>

</xml_diff>

<commit_message>
Implemented May 22 2026 feedback
</commit_message>
<xml_diff>
--- a/docassemble/MinorGuardianshipDischarge/data/templates/guardianship_discharge_order.docx
+++ b/docassemble/MinorGuardianshipDischarge/data/templates/guardianship_discharge_order.docx
@@ -7,7 +7,7 @@
         <w:spacing w:after="0" w:line="240" w:lineRule="auto"/>
         <w:jc w:val="center"/>
         <w:rPr>
-          <w:rFonts w:ascii="Times New Roman" w:hAnsi="Times New Roman"/>
+          <w:rFonts w:ascii="Arial" w:hAnsi="Arial" w:cs="Arial"/>
           <w:color w:val="000000"/>
           <w:sz w:val="24"/>
           <w:szCs w:val="24"/>
@@ -15,12 +15,72 @@
       </w:pPr>
       <w:r>
         <w:rPr>
-          <w:rFonts w:ascii="Times New Roman" w:hAnsi="Times New Roman"/>
+          <w:rFonts w:ascii="Arial" w:hAnsi="Arial" w:cs="Arial"/>
           <w:b/>
           <w:sz w:val="24"/>
           <w:szCs w:val="24"/>
         </w:rPr>
-        <w:t>IN THE CIRCUIT COURT OF {{trial_court.address.county.upper()}} COUNTY, ILLINOIS</w:t>
+        <w:t>IN THE CIRCUIT COURT OF {{</w:t>
+      </w:r>
+      <w:proofErr w:type="spellStart"/>
+      <w:r>
+        <w:rPr>
+          <w:rFonts w:ascii="Arial" w:hAnsi="Arial" w:cs="Arial"/>
+          <w:b/>
+          <w:sz w:val="24"/>
+          <w:szCs w:val="24"/>
+        </w:rPr>
+        <w:t>trial_</w:t>
+      </w:r>
+      <w:proofErr w:type="gramStart"/>
+      <w:r>
+        <w:rPr>
+          <w:rFonts w:ascii="Arial" w:hAnsi="Arial" w:cs="Arial"/>
+          <w:b/>
+          <w:sz w:val="24"/>
+          <w:szCs w:val="24"/>
+        </w:rPr>
+        <w:t>court.address</w:t>
+      </w:r>
+      <w:proofErr w:type="gramEnd"/>
+      <w:r>
+        <w:rPr>
+          <w:rFonts w:ascii="Arial" w:hAnsi="Arial" w:cs="Arial"/>
+          <w:b/>
+          <w:sz w:val="24"/>
+          <w:szCs w:val="24"/>
+        </w:rPr>
+        <w:t>.</w:t>
+      </w:r>
+      <w:proofErr w:type="gramStart"/>
+      <w:r>
+        <w:rPr>
+          <w:rFonts w:ascii="Arial" w:hAnsi="Arial" w:cs="Arial"/>
+          <w:b/>
+          <w:sz w:val="24"/>
+          <w:szCs w:val="24"/>
+        </w:rPr>
+        <w:t>county.upper</w:t>
+      </w:r>
+      <w:proofErr w:type="spellEnd"/>
+      <w:r>
+        <w:rPr>
+          <w:rFonts w:ascii="Arial" w:hAnsi="Arial" w:cs="Arial"/>
+          <w:b/>
+          <w:sz w:val="24"/>
+          <w:szCs w:val="24"/>
+        </w:rPr>
+        <w:t>()}}</w:t>
+      </w:r>
+      <w:proofErr w:type="gramEnd"/>
+      <w:r>
+        <w:rPr>
+          <w:rFonts w:ascii="Arial" w:hAnsi="Arial" w:cs="Arial"/>
+          <w:b/>
+          <w:sz w:val="24"/>
+          <w:szCs w:val="24"/>
+        </w:rPr>
+        <w:t xml:space="preserve"> COUNTY, ILLINOIS</w:t>
       </w:r>
     </w:p>
     <w:p>
@@ -30,50 +90,593 @@
         </w:tabs>
         <w:spacing w:after="0" w:line="240" w:lineRule="auto"/>
         <w:rPr>
-          <w:rFonts w:ascii="Times New Roman" w:hAnsi="Times New Roman"/>
+          <w:rFonts w:ascii="Arial" w:hAnsi="Arial" w:cs="Arial"/>
           <w:color w:val="000000"/>
           <w:sz w:val="24"/>
           <w:szCs w:val="24"/>
         </w:rPr>
       </w:pPr>
-      <w:r>
-        <w:rPr>
-          <w:rFonts w:ascii="Times New Roman" w:hAnsi="Times New Roman"/>
+    </w:p>
+    <w:tbl>
+      <w:tblPr>
+        <w:tblStyle w:val="TableGrid"/>
+        <w:tblW w:w="0" w:type="auto"/>
+        <w:tblLayout w:type="fixed"/>
+        <w:tblLook w:val="04A0" w:firstRow="1" w:lastRow="0" w:firstColumn="1" w:lastColumn="0" w:noHBand="0" w:noVBand="1"/>
+      </w:tblPr>
+      <w:tblGrid>
+        <w:gridCol w:w="3960"/>
+        <w:gridCol w:w="720"/>
+        <w:gridCol w:w="720"/>
+        <w:gridCol w:w="3370"/>
+        <w:gridCol w:w="590"/>
+      </w:tblGrid>
+      <w:tr>
+        <w:tc>
+          <w:tcPr>
+            <w:tcW w:w="3960" w:type="dxa"/>
+            <w:tcBorders>
+              <w:top w:val="nil"/>
+              <w:left w:val="nil"/>
+              <w:bottom w:val="nil"/>
+              <w:right w:val="nil"/>
+            </w:tcBorders>
+          </w:tcPr>
+          <w:p>
+            <w:pPr>
+              <w:tabs>
+                <w:tab w:val="left" w:pos="4320"/>
+              </w:tabs>
+              <w:spacing w:after="0" w:line="240" w:lineRule="auto"/>
+              <w:rPr>
+                <w:rFonts w:ascii="Arial" w:hAnsi="Arial" w:cs="Arial"/>
+                <w:color w:val="000000"/>
+                <w:sz w:val="24"/>
+                <w:szCs w:val="24"/>
+              </w:rPr>
+            </w:pPr>
+            <w:r>
+              <w:rPr>
+                <w:rFonts w:ascii="Arial" w:hAnsi="Arial" w:cs="Arial"/>
+                <w:color w:val="000000"/>
+                <w:sz w:val="24"/>
+                <w:szCs w:val="24"/>
+              </w:rPr>
+              <w:t>IN </w:t>
+            </w:r>
+            <w:r>
+              <w:rPr>
+                <w:rFonts w:ascii="Arial" w:hAnsi="Arial" w:cs="Arial"/>
+                <w:color w:val="000000"/>
+                <w:sz w:val="24"/>
+                <w:szCs w:val="24"/>
+              </w:rPr>
+              <w:t xml:space="preserve">RE </w:t>
+            </w:r>
+            <w:r>
+              <w:rPr>
+                <w:rFonts w:ascii="Arial" w:hAnsi="Arial" w:cs="Arial"/>
+                <w:color w:val="000000"/>
+                <w:sz w:val="24"/>
+                <w:szCs w:val="24"/>
+              </w:rPr>
+              <w:t>THE ESTATE OF: </w:t>
+            </w:r>
+          </w:p>
+        </w:tc>
+        <w:tc>
+          <w:tcPr>
+            <w:tcW w:w="720" w:type="dxa"/>
+            <w:tcBorders>
+              <w:top w:val="nil"/>
+              <w:left w:val="nil"/>
+              <w:bottom w:val="nil"/>
+              <w:right w:val="single" w:sz="4" w:space="0" w:color="auto"/>
+            </w:tcBorders>
+          </w:tcPr>
+          <w:p>
+            <w:pPr>
+              <w:tabs>
+                <w:tab w:val="left" w:pos="4320"/>
+              </w:tabs>
+              <w:spacing w:after="0" w:line="240" w:lineRule="auto"/>
+              <w:rPr>
+                <w:rFonts w:ascii="Arial" w:hAnsi="Arial" w:cs="Arial"/>
+                <w:color w:val="000000"/>
+                <w:sz w:val="24"/>
+                <w:szCs w:val="24"/>
+              </w:rPr>
+            </w:pPr>
+          </w:p>
+        </w:tc>
+        <w:tc>
+          <w:tcPr>
+            <w:tcW w:w="720" w:type="dxa"/>
+            <w:tcBorders>
+              <w:top w:val="nil"/>
+              <w:left w:val="single" w:sz="4" w:space="0" w:color="auto"/>
+              <w:bottom w:val="nil"/>
+              <w:right w:val="nil"/>
+            </w:tcBorders>
+          </w:tcPr>
+          <w:p>
+            <w:pPr>
+              <w:tabs>
+                <w:tab w:val="left" w:pos="4320"/>
+              </w:tabs>
+              <w:spacing w:after="0" w:line="240" w:lineRule="auto"/>
+              <w:rPr>
+                <w:rFonts w:ascii="Arial" w:hAnsi="Arial" w:cs="Arial"/>
+                <w:color w:val="000000"/>
+                <w:sz w:val="24"/>
+                <w:szCs w:val="24"/>
+              </w:rPr>
+            </w:pPr>
+          </w:p>
+        </w:tc>
+        <w:tc>
+          <w:tcPr>
+            <w:tcW w:w="3370" w:type="dxa"/>
+            <w:tcBorders>
+              <w:top w:val="nil"/>
+              <w:left w:val="nil"/>
+              <w:bottom w:val="nil"/>
+              <w:right w:val="nil"/>
+            </w:tcBorders>
+          </w:tcPr>
+          <w:p>
+            <w:pPr>
+              <w:tabs>
+                <w:tab w:val="left" w:pos="4320"/>
+              </w:tabs>
+              <w:spacing w:after="0" w:line="240" w:lineRule="auto"/>
+              <w:rPr>
+                <w:rFonts w:ascii="Arial" w:hAnsi="Arial" w:cs="Arial"/>
+                <w:color w:val="000000"/>
+                <w:sz w:val="24"/>
+                <w:szCs w:val="24"/>
+              </w:rPr>
+            </w:pPr>
+          </w:p>
+        </w:tc>
+        <w:tc>
+          <w:tcPr>
+            <w:tcW w:w="590" w:type="dxa"/>
+            <w:tcBorders>
+              <w:top w:val="nil"/>
+              <w:left w:val="nil"/>
+              <w:bottom w:val="nil"/>
+              <w:right w:val="nil"/>
+            </w:tcBorders>
+          </w:tcPr>
+          <w:p>
+            <w:pPr>
+              <w:tabs>
+                <w:tab w:val="left" w:pos="4320"/>
+              </w:tabs>
+              <w:spacing w:after="0" w:line="240" w:lineRule="auto"/>
+              <w:rPr>
+                <w:rFonts w:ascii="Arial" w:hAnsi="Arial" w:cs="Arial"/>
+                <w:color w:val="000000"/>
+                <w:sz w:val="24"/>
+                <w:szCs w:val="24"/>
+              </w:rPr>
+            </w:pPr>
+          </w:p>
+        </w:tc>
+      </w:tr>
+      <w:tr>
+        <w:tc>
+          <w:tcPr>
+            <w:tcW w:w="3960" w:type="dxa"/>
+            <w:tcBorders>
+              <w:top w:val="nil"/>
+              <w:left w:val="nil"/>
+              <w:bottom w:val="single" w:sz="4" w:space="0" w:color="auto"/>
+              <w:right w:val="nil"/>
+            </w:tcBorders>
+          </w:tcPr>
+          <w:p>
+            <w:pPr>
+              <w:tabs>
+                <w:tab w:val="left" w:pos="4320"/>
+              </w:tabs>
+              <w:spacing w:after="0" w:line="240" w:lineRule="auto"/>
+              <w:rPr>
+                <w:rFonts w:ascii="Arial" w:hAnsi="Arial" w:cs="Arial"/>
+                <w:color w:val="000000"/>
+                <w:sz w:val="24"/>
+                <w:szCs w:val="24"/>
+              </w:rPr>
+            </w:pPr>
+            <w:r>
+              <w:rPr>
+                <w:rFonts w:ascii="Arial" w:hAnsi="Arial" w:cs="Arial"/>
+                <w:sz w:val="24"/>
+                <w:szCs w:val="24"/>
+              </w:rPr>
+              <w:t>{{</w:t>
+            </w:r>
+            <w:proofErr w:type="spellStart"/>
+            <w:r>
+              <w:rPr>
+                <w:rFonts w:ascii="Arial" w:hAnsi="Arial" w:cs="Arial"/>
+                <w:sz w:val="24"/>
+                <w:szCs w:val="24"/>
+              </w:rPr>
+              <w:t>child.name_</w:t>
+            </w:r>
+            <w:proofErr w:type="gramStart"/>
+            <w:r>
+              <w:rPr>
+                <w:rFonts w:ascii="Arial" w:hAnsi="Arial" w:cs="Arial"/>
+                <w:sz w:val="24"/>
+                <w:szCs w:val="24"/>
+              </w:rPr>
+              <w:t>full</w:t>
+            </w:r>
+            <w:proofErr w:type="spellEnd"/>
+            <w:r>
+              <w:rPr>
+                <w:rFonts w:ascii="Arial" w:hAnsi="Arial" w:cs="Arial"/>
+                <w:sz w:val="24"/>
+                <w:szCs w:val="24"/>
+              </w:rPr>
+              <w:t>(</w:t>
+            </w:r>
+            <w:proofErr w:type="gramEnd"/>
+            <w:r>
+              <w:rPr>
+                <w:rFonts w:ascii="Arial" w:hAnsi="Arial" w:cs="Arial"/>
+                <w:sz w:val="24"/>
+                <w:szCs w:val="24"/>
+              </w:rPr>
+              <w:t>)}}</w:t>
+            </w:r>
+          </w:p>
+        </w:tc>
+        <w:tc>
+          <w:tcPr>
+            <w:tcW w:w="720" w:type="dxa"/>
+            <w:tcBorders>
+              <w:top w:val="nil"/>
+              <w:left w:val="nil"/>
+              <w:bottom w:val="nil"/>
+              <w:right w:val="single" w:sz="4" w:space="0" w:color="auto"/>
+            </w:tcBorders>
+          </w:tcPr>
+          <w:p>
+            <w:pPr>
+              <w:tabs>
+                <w:tab w:val="left" w:pos="4320"/>
+              </w:tabs>
+              <w:spacing w:after="0" w:line="240" w:lineRule="auto"/>
+              <w:rPr>
+                <w:rFonts w:ascii="Arial" w:hAnsi="Arial" w:cs="Arial"/>
+                <w:color w:val="000000"/>
+                <w:sz w:val="24"/>
+                <w:szCs w:val="24"/>
+              </w:rPr>
+            </w:pPr>
+          </w:p>
+        </w:tc>
+        <w:tc>
+          <w:tcPr>
+            <w:tcW w:w="720" w:type="dxa"/>
+            <w:tcBorders>
+              <w:top w:val="nil"/>
+              <w:left w:val="single" w:sz="4" w:space="0" w:color="auto"/>
+              <w:bottom w:val="nil"/>
+              <w:right w:val="nil"/>
+            </w:tcBorders>
+          </w:tcPr>
+          <w:p>
+            <w:pPr>
+              <w:tabs>
+                <w:tab w:val="left" w:pos="4320"/>
+              </w:tabs>
+              <w:spacing w:after="0" w:line="240" w:lineRule="auto"/>
+              <w:rPr>
+                <w:rFonts w:ascii="Arial" w:hAnsi="Arial" w:cs="Arial"/>
+                <w:color w:val="000000"/>
+                <w:sz w:val="24"/>
+                <w:szCs w:val="24"/>
+              </w:rPr>
+            </w:pPr>
+          </w:p>
+        </w:tc>
+        <w:tc>
+          <w:tcPr>
+            <w:tcW w:w="3370" w:type="dxa"/>
+            <w:tcBorders>
+              <w:top w:val="nil"/>
+              <w:left w:val="nil"/>
+              <w:bottom w:val="single" w:sz="4" w:space="0" w:color="auto"/>
+              <w:right w:val="nil"/>
+            </w:tcBorders>
+          </w:tcPr>
+          <w:p>
+            <w:pPr>
+              <w:tabs>
+                <w:tab w:val="left" w:pos="4320"/>
+              </w:tabs>
+              <w:spacing w:after="0" w:line="240" w:lineRule="auto"/>
+              <w:rPr>
+                <w:rFonts w:ascii="Arial" w:hAnsi="Arial" w:cs="Arial"/>
+                <w:color w:val="000000"/>
+                <w:sz w:val="24"/>
+                <w:szCs w:val="24"/>
+              </w:rPr>
+            </w:pPr>
+            <w:r>
+              <w:rPr>
+                <w:rFonts w:ascii="Arial" w:hAnsi="Arial" w:cs="Arial"/>
+                <w:color w:val="000000"/>
+                <w:sz w:val="24"/>
+                <w:szCs w:val="24"/>
+              </w:rPr>
+              <w:t xml:space="preserve">NO. {% if </w:t>
+            </w:r>
+            <w:proofErr w:type="spellStart"/>
+            <w:r>
+              <w:rPr>
+                <w:rFonts w:ascii="Arial" w:hAnsi="Arial" w:cs="Arial"/>
+                <w:color w:val="000000"/>
+                <w:sz w:val="24"/>
+                <w:szCs w:val="24"/>
+              </w:rPr>
+              <w:t>case_</w:t>
+            </w:r>
+            <w:proofErr w:type="gramStart"/>
+            <w:r>
+              <w:rPr>
+                <w:rFonts w:ascii="Arial" w:hAnsi="Arial" w:cs="Arial"/>
+                <w:color w:val="000000"/>
+                <w:sz w:val="24"/>
+                <w:szCs w:val="24"/>
+              </w:rPr>
+              <w:t>number</w:t>
+            </w:r>
+            <w:proofErr w:type="spellEnd"/>
+            <w:r>
+              <w:rPr>
+                <w:rFonts w:ascii="Arial" w:hAnsi="Arial" w:cs="Arial"/>
+                <w:color w:val="000000"/>
+                <w:sz w:val="24"/>
+                <w:szCs w:val="24"/>
+              </w:rPr>
+              <w:t xml:space="preserve"> !</w:t>
+            </w:r>
+            <w:proofErr w:type="gramEnd"/>
+            <w:r>
+              <w:rPr>
+                <w:rFonts w:ascii="Arial" w:hAnsi="Arial" w:cs="Arial"/>
+                <w:color w:val="000000"/>
+                <w:sz w:val="24"/>
+                <w:szCs w:val="24"/>
+              </w:rPr>
+              <w:t xml:space="preserve">= “” </w:t>
+            </w:r>
+            <w:proofErr w:type="gramStart"/>
+            <w:r>
+              <w:rPr>
+                <w:rFonts w:ascii="Arial" w:hAnsi="Arial" w:cs="Arial"/>
+                <w:color w:val="000000"/>
+                <w:sz w:val="24"/>
+                <w:szCs w:val="24"/>
+              </w:rPr>
+              <w:t>%}{</w:t>
+            </w:r>
+            <w:proofErr w:type="gramEnd"/>
+            <w:r>
+              <w:rPr>
+                <w:rFonts w:ascii="Arial" w:hAnsi="Arial" w:cs="Arial"/>
+                <w:color w:val="000000"/>
+                <w:sz w:val="24"/>
+                <w:szCs w:val="24"/>
+              </w:rPr>
+              <w:t>{</w:t>
+            </w:r>
+            <w:proofErr w:type="spellStart"/>
+            <w:r>
+              <w:rPr>
+                <w:rFonts w:ascii="Arial" w:hAnsi="Arial" w:cs="Arial"/>
+                <w:color w:val="000000"/>
+                <w:sz w:val="24"/>
+                <w:szCs w:val="24"/>
+              </w:rPr>
+              <w:t>case_number</w:t>
+            </w:r>
+            <w:proofErr w:type="spellEnd"/>
+            <w:proofErr w:type="gramStart"/>
+            <w:r>
+              <w:rPr>
+                <w:rFonts w:ascii="Arial" w:hAnsi="Arial" w:cs="Arial"/>
+                <w:color w:val="000000"/>
+                <w:sz w:val="24"/>
+                <w:szCs w:val="24"/>
+              </w:rPr>
+              <w:t>}}{</w:t>
+            </w:r>
+            <w:proofErr w:type="gramEnd"/>
+            <w:r>
+              <w:rPr>
+                <w:rFonts w:ascii="Arial" w:hAnsi="Arial" w:cs="Arial"/>
+                <w:color w:val="000000"/>
+                <w:sz w:val="24"/>
+                <w:szCs w:val="24"/>
+              </w:rPr>
+              <w:t>% endif %}</w:t>
+            </w:r>
+          </w:p>
+        </w:tc>
+        <w:tc>
+          <w:tcPr>
+            <w:tcW w:w="590" w:type="dxa"/>
+            <w:tcBorders>
+              <w:top w:val="nil"/>
+              <w:left w:val="nil"/>
+              <w:bottom w:val="nil"/>
+              <w:right w:val="nil"/>
+            </w:tcBorders>
+          </w:tcPr>
+          <w:p>
+            <w:pPr>
+              <w:tabs>
+                <w:tab w:val="left" w:pos="4320"/>
+              </w:tabs>
+              <w:spacing w:after="0" w:line="240" w:lineRule="auto"/>
+              <w:rPr>
+                <w:rFonts w:ascii="Arial" w:hAnsi="Arial" w:cs="Arial"/>
+                <w:color w:val="000000"/>
+                <w:sz w:val="24"/>
+                <w:szCs w:val="24"/>
+              </w:rPr>
+            </w:pPr>
+          </w:p>
+        </w:tc>
+      </w:tr>
+      <w:tr>
+        <w:tc>
+          <w:tcPr>
+            <w:tcW w:w="3960" w:type="dxa"/>
+            <w:tcBorders>
+              <w:top w:val="single" w:sz="4" w:space="0" w:color="auto"/>
+              <w:left w:val="nil"/>
+              <w:bottom w:val="nil"/>
+              <w:right w:val="nil"/>
+            </w:tcBorders>
+          </w:tcPr>
+          <w:p>
+            <w:pPr>
+              <w:tabs>
+                <w:tab w:val="left" w:pos="4320"/>
+              </w:tabs>
+              <w:spacing w:after="0" w:line="240" w:lineRule="auto"/>
+              <w:rPr>
+                <w:rFonts w:ascii="Arial" w:hAnsi="Arial" w:cs="Arial"/>
+                <w:color w:val="000000"/>
+                <w:sz w:val="24"/>
+                <w:szCs w:val="24"/>
+              </w:rPr>
+            </w:pPr>
+          </w:p>
+        </w:tc>
+        <w:tc>
+          <w:tcPr>
+            <w:tcW w:w="720" w:type="dxa"/>
+            <w:tcBorders>
+              <w:top w:val="nil"/>
+              <w:left w:val="nil"/>
+              <w:bottom w:val="nil"/>
+              <w:right w:val="single" w:sz="4" w:space="0" w:color="auto"/>
+            </w:tcBorders>
+          </w:tcPr>
+          <w:p>
+            <w:pPr>
+              <w:tabs>
+                <w:tab w:val="left" w:pos="4320"/>
+              </w:tabs>
+              <w:spacing w:after="0" w:line="240" w:lineRule="auto"/>
+              <w:rPr>
+                <w:rFonts w:ascii="Arial" w:hAnsi="Arial" w:cs="Arial"/>
+                <w:color w:val="000000"/>
+                <w:sz w:val="24"/>
+                <w:szCs w:val="24"/>
+              </w:rPr>
+            </w:pPr>
+          </w:p>
+        </w:tc>
+        <w:tc>
+          <w:tcPr>
+            <w:tcW w:w="720" w:type="dxa"/>
+            <w:tcBorders>
+              <w:top w:val="nil"/>
+              <w:left w:val="single" w:sz="4" w:space="0" w:color="auto"/>
+              <w:bottom w:val="nil"/>
+              <w:right w:val="nil"/>
+            </w:tcBorders>
+          </w:tcPr>
+          <w:p>
+            <w:pPr>
+              <w:tabs>
+                <w:tab w:val="left" w:pos="4320"/>
+              </w:tabs>
+              <w:spacing w:after="0" w:line="240" w:lineRule="auto"/>
+              <w:rPr>
+                <w:rFonts w:ascii="Arial" w:hAnsi="Arial" w:cs="Arial"/>
+                <w:color w:val="000000"/>
+                <w:sz w:val="24"/>
+                <w:szCs w:val="24"/>
+              </w:rPr>
+            </w:pPr>
+          </w:p>
+        </w:tc>
+        <w:tc>
+          <w:tcPr>
+            <w:tcW w:w="3370" w:type="dxa"/>
+            <w:tcBorders>
+              <w:top w:val="single" w:sz="4" w:space="0" w:color="auto"/>
+              <w:left w:val="nil"/>
+              <w:bottom w:val="nil"/>
+              <w:right w:val="nil"/>
+            </w:tcBorders>
+          </w:tcPr>
+          <w:p>
+            <w:pPr>
+              <w:tabs>
+                <w:tab w:val="left" w:pos="4320"/>
+              </w:tabs>
+              <w:spacing w:after="0" w:line="240" w:lineRule="auto"/>
+              <w:rPr>
+                <w:rFonts w:ascii="Arial" w:hAnsi="Arial" w:cs="Arial"/>
+                <w:color w:val="000000"/>
+                <w:sz w:val="24"/>
+                <w:szCs w:val="24"/>
+              </w:rPr>
+            </w:pPr>
+          </w:p>
+        </w:tc>
+        <w:tc>
+          <w:tcPr>
+            <w:tcW w:w="590" w:type="dxa"/>
+            <w:tcBorders>
+              <w:top w:val="nil"/>
+              <w:left w:val="nil"/>
+              <w:bottom w:val="nil"/>
+              <w:right w:val="nil"/>
+            </w:tcBorders>
+          </w:tcPr>
+          <w:p>
+            <w:pPr>
+              <w:tabs>
+                <w:tab w:val="left" w:pos="4320"/>
+              </w:tabs>
+              <w:spacing w:after="0" w:line="240" w:lineRule="auto"/>
+              <w:rPr>
+                <w:rFonts w:ascii="Arial" w:hAnsi="Arial" w:cs="Arial"/>
+                <w:color w:val="000000"/>
+                <w:sz w:val="24"/>
+                <w:szCs w:val="24"/>
+              </w:rPr>
+            </w:pPr>
+          </w:p>
+        </w:tc>
+      </w:tr>
+    </w:tbl>
+    <w:p>
+      <w:pPr>
+        <w:tabs>
+          <w:tab w:val="left" w:pos="4320"/>
+        </w:tabs>
+        <w:spacing w:after="0" w:line="240" w:lineRule="auto"/>
+        <w:rPr>
+          <w:rFonts w:ascii="Arial" w:hAnsi="Arial" w:cs="Arial"/>
           <w:color w:val="000000"/>
           <w:sz w:val="24"/>
           <w:szCs w:val="24"/>
         </w:rPr>
-        <w:br/>
-        <w:t>IN THE ESTATE OF</w:t>
-      </w:r>
-      <w:r>
-        <w:rPr>
-          <w:rFonts w:ascii="Times New Roman" w:hAnsi="Times New Roman"/>
-          <w:color w:val="000000"/>
-          <w:sz w:val="24"/>
-          <w:szCs w:val="24"/>
-        </w:rPr>
-        <w:t>:</w:t>
-      </w:r>
-      <w:r>
-        <w:rPr>
-          <w:rFonts w:ascii="Times New Roman" w:hAnsi="Times New Roman"/>
-          <w:color w:val="000000"/>
-          <w:sz w:val="24"/>
-          <w:szCs w:val="24"/>
-        </w:rPr>
-        <w:t> </w:t>
-      </w:r>
-      <w:r>
-        <w:rPr>
-          <w:rFonts w:ascii="Times New Roman" w:hAnsi="Times New Roman"/>
-          <w:color w:val="000000"/>
-          <w:sz w:val="24"/>
-          <w:szCs w:val="24"/>
-        </w:rPr>
-        <w:tab/>
-        <w:t>)</w:t>
-      </w:r>
+      </w:pPr>
     </w:p>
     <w:p>
       <w:pPr>
@@ -81,31 +684,76 @@
           <w:tab w:val="left" w:pos="4320"/>
         </w:tabs>
         <w:spacing w:after="0" w:line="240" w:lineRule="auto"/>
-        <w:rPr>
-          <w:rFonts w:ascii="Times New Roman" w:hAnsi="Times New Roman"/>
-          <w:color w:val="000000"/>
+        <w:jc w:val="center"/>
+        <w:rPr>
+          <w:rFonts w:ascii="Arial" w:hAnsi="Arial" w:cs="Arial"/>
+          <w:b/>
           <w:sz w:val="24"/>
           <w:szCs w:val="24"/>
         </w:rPr>
       </w:pPr>
       <w:r>
         <w:rPr>
-          <w:rFonts w:ascii="Times New Roman" w:hAnsi="Times New Roman"/>
-          <w:sz w:val="24"/>
-          <w:szCs w:val="24"/>
-          <w:u w:val="single"/>
-        </w:rPr>
-        <w:t>{{child.name_full()}}</w:t>
-      </w:r>
-      <w:r>
-        <w:rPr>
-          <w:rFonts w:ascii="Times New Roman" w:hAnsi="Times New Roman"/>
-          <w:color w:val="000000"/>
-          <w:sz w:val="24"/>
-          <w:szCs w:val="24"/>
-        </w:rPr>
-        <w:tab/>
-        <w:t>)</w:t>
+          <w:rFonts w:ascii="Arial" w:hAnsi="Arial" w:cs="Arial"/>
+          <w:b/>
+          <w:sz w:val="24"/>
+          <w:szCs w:val="24"/>
+        </w:rPr>
+        <w:t>ORDER</w:t>
+      </w:r>
+      <w:r>
+        <w:rPr>
+          <w:rFonts w:ascii="Arial" w:hAnsi="Arial" w:cs="Arial"/>
+          <w:b/>
+          <w:sz w:val="24"/>
+          <w:szCs w:val="24"/>
+        </w:rPr>
+        <w:t xml:space="preserve"> </w:t>
+      </w:r>
+      <w:r>
+        <w:rPr>
+          <w:rFonts w:ascii="Arial" w:hAnsi="Arial" w:cs="Arial"/>
+          <w:b/>
+          <w:sz w:val="24"/>
+          <w:szCs w:val="24"/>
+        </w:rPr>
+        <w:t>TO</w:t>
+      </w:r>
+      <w:r>
+        <w:rPr>
+          <w:rFonts w:ascii="Arial" w:hAnsi="Arial" w:cs="Arial"/>
+          <w:b/>
+          <w:sz w:val="24"/>
+          <w:szCs w:val="24"/>
+        </w:rPr>
+        <w:t xml:space="preserve"> </w:t>
+      </w:r>
+      <w:r>
+        <w:rPr>
+          <w:rFonts w:ascii="Arial" w:hAnsi="Arial" w:cs="Arial"/>
+          <w:b/>
+          <w:sz w:val="24"/>
+          <w:szCs w:val="24"/>
+        </w:rPr>
+        <w:t>DISCHARGE</w:t>
+      </w:r>
+      <w:r>
+        <w:rPr>
+          <w:rFonts w:ascii="Arial" w:hAnsi="Arial" w:cs="Arial"/>
+          <w:b/>
+          <w:sz w:val="24"/>
+          <w:szCs w:val="24"/>
+        </w:rPr>
+        <w:t xml:space="preserve"> </w:t>
+      </w:r>
+      <w:r>
+        <w:rPr>
+          <w:rFonts w:ascii="Arial" w:hAnsi="Arial" w:cs="Arial"/>
+          <w:b/>
+          <w:sz w:val="24"/>
+          <w:szCs w:val="24"/>
+        </w:rPr>
+        <w:t>GUARDIANSHIP</w:t>
       </w:r>
     </w:p>
     <w:p>
@@ -113,460 +761,186 @@
         <w:tabs>
           <w:tab w:val="left" w:pos="4320"/>
         </w:tabs>
-        <w:rPr>
-          <w:color w:val="000000" w:themeColor="text1"/>
-        </w:rPr>
-      </w:pPr>
-      <w:r>
-        <w:rPr>
-          <w:rFonts w:ascii="Times New Roman" w:hAnsi="Times New Roman"/>
-          <w:color w:val="000000"/>
-          <w:sz w:val="24"/>
-          <w:szCs w:val="24"/>
-        </w:rPr>
-        <w:t>(Name of Minor)</w:t>
-      </w:r>
-      <w:r>
-        <w:rPr>
-          <w:rFonts w:ascii="Times New Roman" w:hAnsi="Times New Roman"/>
-          <w:color w:val="000000"/>
-          <w:sz w:val="24"/>
-          <w:szCs w:val="24"/>
-        </w:rPr>
-        <w:tab/>
-        <w:t>)</w:t>
-      </w:r>
-      <w:r>
-        <w:rPr>
-          <w:rFonts w:ascii="Times New Roman" w:hAnsi="Times New Roman"/>
-          <w:color w:val="000000"/>
-          <w:sz w:val="24"/>
-          <w:szCs w:val="24"/>
-        </w:rPr>
-        <w:t xml:space="preserve"> </w:t>
-      </w:r>
-      <w:r>
-        <w:rPr>
-          <w:rFonts w:ascii="Times New Roman" w:hAnsi="Times New Roman"/>
-          <w:color w:val="000000"/>
-          <w:sz w:val="24"/>
-          <w:szCs w:val="24"/>
-        </w:rPr>
-        <w:t xml:space="preserve">    NO. </w:t>
-      </w:r>
-      <w:r>
-        <w:rPr>
-          <w:rFonts w:ascii="Times New Roman" w:hAnsi="Times New Roman"/>
-          <w:color w:val="000000"/>
-          <w:sz w:val="24"/>
-          <w:szCs w:val="24"/>
-        </w:rPr>
-        <w:t>{% if case_number != “” %}{{case_number}}{% else %}</w:t>
-      </w:r>
-      <w:r>
-        <w:rPr>
-          <w:rFonts w:ascii="Times New Roman" w:hAnsi="Times New Roman"/>
-          <w:color w:val="000000"/>
-          <w:sz w:val="24"/>
-          <w:szCs w:val="24"/>
-        </w:rPr>
-        <w:t>_______________</w:t>
-      </w:r>
-      <w:r>
-        <w:rPr>
-          <w:rFonts w:ascii="Times New Roman" w:hAnsi="Times New Roman"/>
-          <w:color w:val="000000"/>
-          <w:sz w:val="24"/>
-          <w:szCs w:val="24"/>
-        </w:rPr>
-        <w:t>{% endif %}</w:t>
-      </w:r>
-      <w:r>
-        <w:rPr>
-          <w:rFonts w:ascii="Times New Roman" w:hAnsi="Times New Roman"/>
-          <w:color w:val="000000"/>
-          <w:sz w:val="24"/>
-          <w:szCs w:val="24"/>
-        </w:rPr>
-        <w:br/>
-      </w:r>
-      <w:r>
-        <w:rPr>
-          <w:rFonts w:ascii="Times New Roman" w:hAnsi="Times New Roman"/>
-          <w:sz w:val="24"/>
-          <w:szCs w:val="24"/>
-        </w:rPr>
-        <w:tab/>
-        <w:t>)</w:t>
-      </w:r>
-      <w:r>
-        <w:rPr>
-          <w:rFonts w:ascii="Times New Roman" w:hAnsi="Times New Roman"/>
-          <w:color w:val="000000"/>
-          <w:sz w:val="24"/>
-          <w:szCs w:val="24"/>
-        </w:rPr>
-        <w:br/>
-      </w:r>
-    </w:p>
-    <w:p>
-      <w:pPr>
+        <w:spacing w:after="0" w:line="240" w:lineRule="auto"/>
         <w:jc w:val="center"/>
         <w:rPr>
-          <w:rFonts w:ascii="Times New Roman" w:hAnsi="Times New Roman"/>
+          <w:rFonts w:ascii="Arial" w:hAnsi="Arial" w:cs="Arial"/>
           <w:b/>
-          <w:sz w:val="28"/>
-          <w:szCs w:val="28"/>
-        </w:rPr>
-      </w:pPr>
-      <w:r>
-        <w:rPr>
-          <w:rFonts w:ascii="Times New Roman" w:hAnsi="Times New Roman"/>
-          <w:b/>
-          <w:sz w:val="28"/>
-          <w:szCs w:val="28"/>
-        </w:rPr>
-        <w:t>ORDER</w:t>
-      </w:r>
-      <w:r>
-        <w:rPr>
-          <w:rFonts w:ascii="Times New Roman" w:hAnsi="Times New Roman"/>
-          <w:b/>
-          <w:sz w:val="28"/>
-          <w:szCs w:val="28"/>
-        </w:rPr>
-        <w:t xml:space="preserve"> </w:t>
-      </w:r>
-      <w:r>
-        <w:rPr>
-          <w:rFonts w:ascii="Times New Roman" w:hAnsi="Times New Roman"/>
-          <w:b/>
-          <w:sz w:val="28"/>
-          <w:szCs w:val="28"/>
-        </w:rPr>
-        <w:t>TO</w:t>
-      </w:r>
-      <w:r>
-        <w:rPr>
-          <w:rFonts w:ascii="Times New Roman" w:hAnsi="Times New Roman"/>
-          <w:b/>
-          <w:sz w:val="28"/>
-          <w:szCs w:val="28"/>
-        </w:rPr>
-        <w:t xml:space="preserve"> </w:t>
-      </w:r>
-      <w:r>
-        <w:rPr>
-          <w:rFonts w:ascii="Times New Roman" w:hAnsi="Times New Roman"/>
-          <w:b/>
-          <w:sz w:val="28"/>
-          <w:szCs w:val="28"/>
-        </w:rPr>
-        <w:t>DISCHARGE</w:t>
-      </w:r>
-      <w:r>
-        <w:rPr>
-          <w:rFonts w:ascii="Times New Roman" w:hAnsi="Times New Roman"/>
-          <w:b/>
-          <w:sz w:val="28"/>
-          <w:szCs w:val="28"/>
-        </w:rPr>
-        <w:t xml:space="preserve"> </w:t>
-      </w:r>
-      <w:r>
-        <w:rPr>
-          <w:rFonts w:ascii="Times New Roman" w:hAnsi="Times New Roman"/>
-          <w:b/>
-          <w:sz w:val="28"/>
-          <w:szCs w:val="28"/>
-        </w:rPr>
-        <w:t>GUARDIANSHIP</w:t>
-      </w:r>
-    </w:p>
-    <w:p>
-      <w:pPr>
-        <w:rPr>
-          <w:rFonts w:ascii="Times New Roman" w:hAnsi="Times New Roman"/>
-          <w:color w:val="000000" w:themeColor="text1"/>
-          <w:sz w:val="24"/>
-          <w:szCs w:val="24"/>
-        </w:rPr>
-      </w:pPr>
-      <w:r>
-        <w:rPr>
-          <w:rFonts w:ascii="Times New Roman" w:hAnsi="Times New Roman"/>
-          <w:sz w:val="24"/>
-          <w:szCs w:val="24"/>
-        </w:rPr>
-        <w:t xml:space="preserve">This Matter coming to be heard upon petition by </w:t>
-      </w:r>
-      <w:r>
-        <w:rPr>
-          <w:rFonts w:ascii="Times New Roman" w:hAnsi="Times New Roman"/>
-          <w:sz w:val="24"/>
-          <w:szCs w:val="24"/>
-        </w:rPr>
-        <w:t>{{users[0].name_full()}},</w:t>
-      </w:r>
-      <w:r>
-        <w:rPr>
-          <w:rFonts w:ascii="Times New Roman" w:hAnsi="Times New Roman"/>
-          <w:sz w:val="24"/>
-          <w:szCs w:val="24"/>
-        </w:rPr>
-        <w:t xml:space="preserve"> </w:t>
-      </w:r>
-      <w:r>
-        <w:rPr>
-          <w:rFonts w:ascii="Times New Roman" w:hAnsi="Times New Roman"/>
-          <w:color w:val="000000" w:themeColor="text1"/>
-          <w:sz w:val="24"/>
-          <w:szCs w:val="24"/>
-        </w:rPr>
-        <w:t xml:space="preserve">the </w:t>
-      </w:r>
-      <w:r>
-        <w:rPr>
-          <w:rFonts w:ascii="Times New Roman" w:hAnsi="Times New Roman"/>
-          <w:color w:val="000000" w:themeColor="text1"/>
-          <w:sz w:val="24"/>
-          <w:szCs w:val="24"/>
-        </w:rPr>
-        <w:t>parent</w:t>
-      </w:r>
-      <w:r>
-        <w:rPr>
-          <w:rFonts w:ascii="Times New Roman" w:hAnsi="Times New Roman"/>
-          <w:color w:val="000000" w:themeColor="text1"/>
-          <w:sz w:val="24"/>
-          <w:szCs w:val="24"/>
-        </w:rPr>
-        <w:t xml:space="preserve"> o</w:t>
-      </w:r>
-      <w:r>
-        <w:rPr>
-          <w:rFonts w:ascii="Times New Roman" w:hAnsi="Times New Roman"/>
-          <w:color w:val="000000" w:themeColor="text1"/>
-          <w:sz w:val="24"/>
-          <w:szCs w:val="24"/>
-        </w:rPr>
-        <w:t>f {{child.name_full()}}</w:t>
-      </w:r>
-      <w:r>
-        <w:rPr>
-          <w:rFonts w:ascii="Times New Roman" w:hAnsi="Times New Roman"/>
-          <w:color w:val="000000" w:themeColor="text1"/>
-          <w:sz w:val="24"/>
-          <w:szCs w:val="24"/>
-        </w:rPr>
-        <w:t>,</w:t>
-      </w:r>
-      <w:r>
-        <w:rPr>
-          <w:rFonts w:ascii="Times New Roman" w:hAnsi="Times New Roman"/>
-          <w:color w:val="000000" w:themeColor="text1"/>
-          <w:sz w:val="24"/>
-          <w:szCs w:val="24"/>
-        </w:rPr>
-        <w:t xml:space="preserve"> </w:t>
-      </w:r>
-      <w:r>
-        <w:rPr>
-          <w:rFonts w:ascii="Times New Roman" w:hAnsi="Times New Roman"/>
-          <w:color w:val="000000" w:themeColor="text1"/>
-          <w:sz w:val="24"/>
-          <w:szCs w:val="24"/>
-        </w:rPr>
-        <w:t>due notice of petition being given, and evidence being heard,</w:t>
-      </w:r>
-    </w:p>
-    <w:p>
-      <w:pPr>
-        <w:rPr>
-          <w:rFonts w:ascii="Times New Roman" w:hAnsi="Times New Roman"/>
-          <w:color w:val="000000" w:themeColor="text1"/>
-          <w:sz w:val="28"/>
-          <w:szCs w:val="28"/>
+          <w:sz w:val="24"/>
+          <w:szCs w:val="24"/>
         </w:rPr>
       </w:pPr>
     </w:p>
     <w:p>
       <w:pPr>
         <w:rPr>
-          <w:rFonts w:ascii="Times New Roman" w:hAnsi="Times New Roman"/>
-          <w:b/>
-          <w:color w:val="000000" w:themeColor="text1"/>
-          <w:sz w:val="28"/>
-          <w:szCs w:val="28"/>
+          <w:rFonts w:ascii="Arial" w:hAnsi="Arial" w:cs="Arial"/>
+          <w:color w:val="000000" w:themeColor="text1"/>
+          <w:sz w:val="24"/>
+          <w:szCs w:val="24"/>
         </w:rPr>
       </w:pPr>
       <w:r>
         <w:rPr>
-          <w:rFonts w:ascii="Times New Roman" w:hAnsi="Times New Roman"/>
-          <w:b/>
-          <w:color w:val="000000" w:themeColor="text1"/>
-          <w:sz w:val="28"/>
-          <w:szCs w:val="28"/>
-        </w:rPr>
-        <w:t>IT</w:t>
-      </w:r>
-      <w:r>
-        <w:rPr>
-          <w:rFonts w:ascii="Times New Roman" w:hAnsi="Times New Roman"/>
-          <w:b/>
-          <w:color w:val="000000" w:themeColor="text1"/>
-          <w:sz w:val="28"/>
-          <w:szCs w:val="28"/>
+          <w:rFonts w:ascii="Arial" w:hAnsi="Arial" w:cs="Arial"/>
+          <w:sz w:val="24"/>
+          <w:szCs w:val="24"/>
+        </w:rPr>
+        <w:t xml:space="preserve">This Matter coming to be heard upon petition by </w:t>
+      </w:r>
+      <w:r>
+        <w:rPr>
+          <w:rFonts w:ascii="Arial" w:hAnsi="Arial" w:cs="Arial"/>
+          <w:sz w:val="24"/>
+          <w:szCs w:val="24"/>
+        </w:rPr>
+        <w:t>{{users[0].</w:t>
+      </w:r>
+      <w:proofErr w:type="spellStart"/>
+      <w:r>
+        <w:rPr>
+          <w:rFonts w:ascii="Arial" w:hAnsi="Arial" w:cs="Arial"/>
+          <w:sz w:val="24"/>
+          <w:szCs w:val="24"/>
+        </w:rPr>
+        <w:t>name_</w:t>
+      </w:r>
+      <w:proofErr w:type="gramStart"/>
+      <w:r>
+        <w:rPr>
+          <w:rFonts w:ascii="Arial" w:hAnsi="Arial" w:cs="Arial"/>
+          <w:sz w:val="24"/>
+          <w:szCs w:val="24"/>
+        </w:rPr>
+        <w:t>full</w:t>
+      </w:r>
+      <w:proofErr w:type="spellEnd"/>
+      <w:r>
+        <w:rPr>
+          <w:rFonts w:ascii="Arial" w:hAnsi="Arial" w:cs="Arial"/>
+          <w:sz w:val="24"/>
+          <w:szCs w:val="24"/>
+        </w:rPr>
+        <w:t>(</w:t>
+      </w:r>
+      <w:proofErr w:type="gramEnd"/>
+      <w:r>
+        <w:rPr>
+          <w:rFonts w:ascii="Arial" w:hAnsi="Arial" w:cs="Arial"/>
+          <w:sz w:val="24"/>
+          <w:szCs w:val="24"/>
+        </w:rPr>
+        <w:t>)}},</w:t>
+      </w:r>
+      <w:r>
+        <w:rPr>
+          <w:rFonts w:ascii="Arial" w:hAnsi="Arial" w:cs="Arial"/>
+          <w:sz w:val="24"/>
+          <w:szCs w:val="24"/>
         </w:rPr>
         <w:t xml:space="preserve"> </w:t>
       </w:r>
       <w:r>
         <w:rPr>
-          <w:rFonts w:ascii="Times New Roman" w:hAnsi="Times New Roman"/>
-          <w:b/>
-          <w:color w:val="000000" w:themeColor="text1"/>
-          <w:sz w:val="28"/>
-          <w:szCs w:val="28"/>
-        </w:rPr>
-        <w:t>IS</w:t>
-      </w:r>
-      <w:r>
-        <w:rPr>
-          <w:rFonts w:ascii="Times New Roman" w:hAnsi="Times New Roman"/>
-          <w:b/>
-          <w:color w:val="000000" w:themeColor="text1"/>
-          <w:sz w:val="28"/>
-          <w:szCs w:val="28"/>
-        </w:rPr>
-        <w:t xml:space="preserve"> </w:t>
-      </w:r>
-      <w:r>
-        <w:rPr>
-          <w:rFonts w:ascii="Times New Roman" w:hAnsi="Times New Roman"/>
-          <w:b/>
-          <w:color w:val="000000" w:themeColor="text1"/>
-          <w:sz w:val="28"/>
-          <w:szCs w:val="28"/>
-        </w:rPr>
-        <w:t>HEREBY</w:t>
-      </w:r>
-      <w:r>
-        <w:rPr>
-          <w:rFonts w:ascii="Times New Roman" w:hAnsi="Times New Roman"/>
-          <w:b/>
-          <w:color w:val="000000" w:themeColor="text1"/>
-          <w:sz w:val="28"/>
-          <w:szCs w:val="28"/>
-        </w:rPr>
-        <w:t xml:space="preserve"> </w:t>
-      </w:r>
-      <w:r>
-        <w:rPr>
-          <w:rFonts w:ascii="Times New Roman" w:hAnsi="Times New Roman"/>
-          <w:b/>
-          <w:color w:val="000000" w:themeColor="text1"/>
-          <w:sz w:val="28"/>
-          <w:szCs w:val="28"/>
-        </w:rPr>
-        <w:t>ORDERED</w:t>
-      </w:r>
-      <w:r>
-        <w:rPr>
-          <w:rFonts w:ascii="Times New Roman" w:hAnsi="Times New Roman"/>
-          <w:b/>
-          <w:color w:val="000000" w:themeColor="text1"/>
-          <w:sz w:val="28"/>
-          <w:szCs w:val="28"/>
-        </w:rPr>
-        <w:t xml:space="preserve"> </w:t>
-      </w:r>
-      <w:r>
-        <w:rPr>
-          <w:rFonts w:ascii="Times New Roman" w:hAnsi="Times New Roman"/>
-          <w:b/>
-          <w:color w:val="000000" w:themeColor="text1"/>
-          <w:sz w:val="28"/>
-          <w:szCs w:val="28"/>
-        </w:rPr>
-        <w:t>THAT</w:t>
-      </w:r>
-      <w:r>
-        <w:rPr>
-          <w:rFonts w:ascii="Times New Roman" w:hAnsi="Times New Roman"/>
-          <w:b/>
-          <w:color w:val="000000" w:themeColor="text1"/>
-          <w:sz w:val="28"/>
-          <w:szCs w:val="28"/>
-        </w:rPr>
-        <w:t>:</w:t>
+          <w:rFonts w:ascii="Arial" w:hAnsi="Arial" w:cs="Arial"/>
+          <w:color w:val="000000" w:themeColor="text1"/>
+          <w:sz w:val="24"/>
+          <w:szCs w:val="24"/>
+        </w:rPr>
+        <w:t xml:space="preserve">the </w:t>
+      </w:r>
+      <w:r>
+        <w:rPr>
+          <w:rFonts w:ascii="Arial" w:hAnsi="Arial" w:cs="Arial"/>
+          <w:color w:val="000000" w:themeColor="text1"/>
+          <w:sz w:val="24"/>
+          <w:szCs w:val="24"/>
+        </w:rPr>
+        <w:t>parent</w:t>
+      </w:r>
+      <w:r>
+        <w:rPr>
+          <w:rFonts w:ascii="Arial" w:hAnsi="Arial" w:cs="Arial"/>
+          <w:color w:val="000000" w:themeColor="text1"/>
+          <w:sz w:val="24"/>
+          <w:szCs w:val="24"/>
+        </w:rPr>
+        <w:t xml:space="preserve"> o</w:t>
+      </w:r>
+      <w:r>
+        <w:rPr>
+          <w:rFonts w:ascii="Arial" w:hAnsi="Arial" w:cs="Arial"/>
+          <w:color w:val="000000" w:themeColor="text1"/>
+          <w:sz w:val="24"/>
+          <w:szCs w:val="24"/>
+        </w:rPr>
+        <w:t>f {{</w:t>
+      </w:r>
+      <w:proofErr w:type="spellStart"/>
+      <w:r>
+        <w:rPr>
+          <w:rFonts w:ascii="Arial" w:hAnsi="Arial" w:cs="Arial"/>
+          <w:color w:val="000000" w:themeColor="text1"/>
+          <w:sz w:val="24"/>
+          <w:szCs w:val="24"/>
+        </w:rPr>
+        <w:t>child.name_</w:t>
+      </w:r>
+      <w:proofErr w:type="gramStart"/>
+      <w:r>
+        <w:rPr>
+          <w:rFonts w:ascii="Arial" w:hAnsi="Arial" w:cs="Arial"/>
+          <w:color w:val="000000" w:themeColor="text1"/>
+          <w:sz w:val="24"/>
+          <w:szCs w:val="24"/>
+        </w:rPr>
+        <w:t>full</w:t>
+      </w:r>
+      <w:proofErr w:type="spellEnd"/>
+      <w:r>
+        <w:rPr>
+          <w:rFonts w:ascii="Arial" w:hAnsi="Arial" w:cs="Arial"/>
+          <w:color w:val="000000" w:themeColor="text1"/>
+          <w:sz w:val="24"/>
+          <w:szCs w:val="24"/>
+        </w:rPr>
+        <w:t>(</w:t>
+      </w:r>
+      <w:proofErr w:type="gramEnd"/>
+      <w:r>
+        <w:rPr>
+          <w:rFonts w:ascii="Arial" w:hAnsi="Arial" w:cs="Arial"/>
+          <w:color w:val="000000" w:themeColor="text1"/>
+          <w:sz w:val="24"/>
+          <w:szCs w:val="24"/>
+        </w:rPr>
+        <w:t>)}}</w:t>
+      </w:r>
+      <w:r>
+        <w:rPr>
+          <w:rFonts w:ascii="Arial" w:hAnsi="Arial" w:cs="Arial"/>
+          <w:color w:val="000000" w:themeColor="text1"/>
+          <w:sz w:val="24"/>
+          <w:szCs w:val="24"/>
+        </w:rPr>
+        <w:t>, due notice of petition being given, and evidence being heard,</w:t>
       </w:r>
     </w:p>
     <w:p>
       <w:pPr>
         <w:rPr>
-          <w:rFonts w:ascii="Times New Roman" w:hAnsi="Times New Roman"/>
+          <w:rFonts w:ascii="Arial" w:hAnsi="Arial" w:cs="Arial"/>
           <w:color w:val="000000" w:themeColor="text1"/>
           <w:sz w:val="24"/>
           <w:szCs w:val="24"/>
         </w:rPr>
       </w:pPr>
-      <w:r>
-        <w:rPr>
-          <w:rFonts w:ascii="Times New Roman" w:hAnsi="Times New Roman"/>
-          <w:color w:val="000000" w:themeColor="text1"/>
-          <w:sz w:val="24"/>
-          <w:szCs w:val="24"/>
-        </w:rPr>
-        <w:t xml:space="preserve">1. The guardianship of </w:t>
-      </w:r>
-      <w:r>
-        <w:rPr>
-          <w:rFonts w:ascii="Times New Roman" w:hAnsi="Times New Roman"/>
-          <w:sz w:val="24"/>
-          <w:szCs w:val="24"/>
-        </w:rPr>
-        <w:t>{{child.name_full()}}</w:t>
-      </w:r>
-      <w:r>
-        <w:rPr>
-          <w:rFonts w:ascii="Times New Roman" w:hAnsi="Times New Roman"/>
-          <w:sz w:val="24"/>
-          <w:szCs w:val="24"/>
-        </w:rPr>
-        <w:t xml:space="preserve"> </w:t>
-      </w:r>
-      <w:r>
-        <w:rPr>
-          <w:rFonts w:ascii="Times New Roman" w:hAnsi="Times New Roman"/>
-          <w:color w:val="000000" w:themeColor="text1"/>
-          <w:sz w:val="24"/>
-          <w:szCs w:val="24"/>
-        </w:rPr>
-        <w:t xml:space="preserve">which had been ordered on </w:t>
-      </w:r>
-      <w:r>
-        <w:rPr>
-          <w:rFonts w:ascii="Times New Roman" w:hAnsi="Times New Roman"/>
-          <w:color w:val="000000" w:themeColor="text1"/>
-          <w:sz w:val="24"/>
-          <w:szCs w:val="24"/>
-        </w:rPr>
-        <w:t xml:space="preserve">{{guardianship_date}} </w:t>
-      </w:r>
-      <w:r>
-        <w:rPr>
-          <w:rFonts w:ascii="Times New Roman" w:hAnsi="Times New Roman"/>
-          <w:color w:val="000000" w:themeColor="text1"/>
-          <w:sz w:val="24"/>
-          <w:szCs w:val="24"/>
-        </w:rPr>
-        <w:t>is hereby terminated.</w:t>
-      </w:r>
     </w:p>
     <w:p>
       <w:pPr>
         <w:rPr>
-          <w:rFonts w:ascii="Times New Roman" w:hAnsi="Times New Roman"/>
+          <w:rFonts w:ascii="Arial" w:hAnsi="Arial" w:cs="Arial"/>
+          <w:b/>
           <w:color w:val="000000" w:themeColor="text1"/>
           <w:sz w:val="24"/>
           <w:szCs w:val="24"/>
@@ -574,25 +948,19 @@
       </w:pPr>
       <w:r>
         <w:rPr>
-          <w:rFonts w:ascii="Times New Roman" w:hAnsi="Times New Roman"/>
-          <w:color w:val="000000" w:themeColor="text1"/>
-          <w:sz w:val="24"/>
-          <w:szCs w:val="24"/>
-        </w:rPr>
-        <w:t xml:space="preserve">2. </w:t>
-      </w:r>
-      <w:r>
-        <w:rPr>
-          <w:rFonts w:ascii="Times New Roman" w:hAnsi="Times New Roman"/>
-          <w:sz w:val="24"/>
-          <w:szCs w:val="24"/>
-        </w:rPr>
-        <w:t>{{other_parties[0].name_full()}}</w:t>
-      </w:r>
-      <w:r>
-        <w:rPr>
-          <w:rFonts w:ascii="Times New Roman" w:hAnsi="Times New Roman"/>
-          <w:color w:val="FF0000"/>
+          <w:rFonts w:ascii="Arial" w:hAnsi="Arial" w:cs="Arial"/>
+          <w:b/>
+          <w:color w:val="000000" w:themeColor="text1"/>
+          <w:sz w:val="24"/>
+          <w:szCs w:val="24"/>
+        </w:rPr>
+        <w:t>IT</w:t>
+      </w:r>
+      <w:r>
+        <w:rPr>
+          <w:rFonts w:ascii="Arial" w:hAnsi="Arial" w:cs="Arial"/>
+          <w:b/>
+          <w:color w:val="000000" w:themeColor="text1"/>
           <w:sz w:val="24"/>
           <w:szCs w:val="24"/>
         </w:rPr>
@@ -600,26 +968,19 @@
       </w:r>
       <w:r>
         <w:rPr>
-          <w:rFonts w:ascii="Times New Roman" w:hAnsi="Times New Roman"/>
-          <w:color w:val="000000" w:themeColor="text1"/>
-          <w:sz w:val="24"/>
-          <w:szCs w:val="24"/>
-        </w:rPr>
-        <w:t xml:space="preserve">is discharged from </w:t>
-      </w:r>
-      <w:r>
-        <w:rPr>
-          <w:rFonts w:ascii="Times New Roman" w:hAnsi="Times New Roman"/>
-          <w:color w:val="000000" w:themeColor="text1"/>
-          <w:sz w:val="24"/>
-          <w:szCs w:val="24"/>
-        </w:rPr>
-        <w:t>their</w:t>
-      </w:r>
-      <w:r>
-        <w:rPr>
-          <w:rFonts w:ascii="Times New Roman" w:hAnsi="Times New Roman"/>
-          <w:color w:val="FF0000"/>
+          <w:rFonts w:ascii="Arial" w:hAnsi="Arial" w:cs="Arial"/>
+          <w:b/>
+          <w:color w:val="000000" w:themeColor="text1"/>
+          <w:sz w:val="24"/>
+          <w:szCs w:val="24"/>
+        </w:rPr>
+        <w:t>IS</w:t>
+      </w:r>
+      <w:r>
+        <w:rPr>
+          <w:rFonts w:ascii="Arial" w:hAnsi="Arial" w:cs="Arial"/>
+          <w:b/>
+          <w:color w:val="000000" w:themeColor="text1"/>
           <w:sz w:val="24"/>
           <w:szCs w:val="24"/>
         </w:rPr>
@@ -627,18 +988,69 @@
       </w:r>
       <w:r>
         <w:rPr>
-          <w:rFonts w:ascii="Times New Roman" w:hAnsi="Times New Roman"/>
-          <w:color w:val="000000" w:themeColor="text1"/>
-          <w:sz w:val="24"/>
-          <w:szCs w:val="24"/>
-        </w:rPr>
-        <w:t>duties as guardian.</w:t>
+          <w:rFonts w:ascii="Arial" w:hAnsi="Arial" w:cs="Arial"/>
+          <w:b/>
+          <w:color w:val="000000" w:themeColor="text1"/>
+          <w:sz w:val="24"/>
+          <w:szCs w:val="24"/>
+        </w:rPr>
+        <w:t>HEREBY</w:t>
+      </w:r>
+      <w:r>
+        <w:rPr>
+          <w:rFonts w:ascii="Arial" w:hAnsi="Arial" w:cs="Arial"/>
+          <w:b/>
+          <w:color w:val="000000" w:themeColor="text1"/>
+          <w:sz w:val="24"/>
+          <w:szCs w:val="24"/>
+        </w:rPr>
+        <w:t xml:space="preserve"> </w:t>
+      </w:r>
+      <w:r>
+        <w:rPr>
+          <w:rFonts w:ascii="Arial" w:hAnsi="Arial" w:cs="Arial"/>
+          <w:b/>
+          <w:color w:val="000000" w:themeColor="text1"/>
+          <w:sz w:val="24"/>
+          <w:szCs w:val="24"/>
+        </w:rPr>
+        <w:t>ORDERED</w:t>
+      </w:r>
+      <w:r>
+        <w:rPr>
+          <w:rFonts w:ascii="Arial" w:hAnsi="Arial" w:cs="Arial"/>
+          <w:b/>
+          <w:color w:val="000000" w:themeColor="text1"/>
+          <w:sz w:val="24"/>
+          <w:szCs w:val="24"/>
+        </w:rPr>
+        <w:t xml:space="preserve"> </w:t>
+      </w:r>
+      <w:r>
+        <w:rPr>
+          <w:rFonts w:ascii="Arial" w:hAnsi="Arial" w:cs="Arial"/>
+          <w:b/>
+          <w:color w:val="000000" w:themeColor="text1"/>
+          <w:sz w:val="24"/>
+          <w:szCs w:val="24"/>
+        </w:rPr>
+        <w:t>THAT</w:t>
+      </w:r>
+      <w:r>
+        <w:rPr>
+          <w:rFonts w:ascii="Arial" w:hAnsi="Arial" w:cs="Arial"/>
+          <w:b/>
+          <w:color w:val="000000" w:themeColor="text1"/>
+          <w:sz w:val="24"/>
+          <w:szCs w:val="24"/>
+        </w:rPr>
+        <w:t>:</w:t>
       </w:r>
     </w:p>
     <w:p>
       <w:pPr>
         <w:rPr>
-          <w:rFonts w:ascii="Times New Roman" w:hAnsi="Times New Roman"/>
+          <w:rFonts w:ascii="Arial" w:hAnsi="Arial" w:cs="Arial"/>
           <w:color w:val="000000" w:themeColor="text1"/>
           <w:sz w:val="24"/>
           <w:szCs w:val="24"/>
@@ -646,54 +1058,342 @@
       </w:pPr>
       <w:r>
         <w:rPr>
-          <w:rFonts w:ascii="Times New Roman" w:hAnsi="Times New Roman"/>
-          <w:color w:val="000000" w:themeColor="text1"/>
-          <w:sz w:val="24"/>
-          <w:szCs w:val="24"/>
-        </w:rPr>
-        <w:t xml:space="preserve">3. Care and custody of the minor is returned to </w:t>
-      </w:r>
-      <w:r>
-        <w:rPr>
-          <w:rFonts w:ascii="Times New Roman" w:hAnsi="Times New Roman"/>
-          <w:color w:val="000000" w:themeColor="text1"/>
-          <w:sz w:val="24"/>
-          <w:szCs w:val="24"/>
-        </w:rPr>
-        <w:t>{{users[0].name_full()}}</w:t>
-      </w:r>
-      <w:r>
-        <w:rPr>
-          <w:rFonts w:ascii="Times New Roman" w:hAnsi="Times New Roman"/>
-          <w:color w:val="000000" w:themeColor="text1"/>
-          <w:sz w:val="24"/>
-          <w:szCs w:val="24"/>
-        </w:rPr>
-        <w:t xml:space="preserve">, </w:t>
-      </w:r>
-      <w:r>
-        <w:rPr>
-          <w:rFonts w:ascii="Times New Roman" w:hAnsi="Times New Roman"/>
-          <w:color w:val="000000" w:themeColor="text1"/>
-          <w:sz w:val="24"/>
-          <w:szCs w:val="24"/>
-        </w:rPr>
-        <w:t>parent</w:t>
-      </w:r>
-      <w:r>
-        <w:rPr>
-          <w:rFonts w:ascii="Times New Roman" w:hAnsi="Times New Roman"/>
-          <w:color w:val="000000" w:themeColor="text1"/>
-          <w:sz w:val="24"/>
-          <w:szCs w:val="24"/>
-        </w:rPr>
-        <w:t xml:space="preserve"> of the child.</w:t>
+          <w:rFonts w:ascii="Arial" w:hAnsi="Arial" w:cs="Arial"/>
+          <w:color w:val="000000" w:themeColor="text1"/>
+          <w:sz w:val="24"/>
+          <w:szCs w:val="24"/>
+        </w:rPr>
+        <w:t xml:space="preserve">1. The guardianship of </w:t>
+      </w:r>
+      <w:r>
+        <w:rPr>
+          <w:rFonts w:ascii="Arial" w:hAnsi="Arial" w:cs="Arial"/>
+          <w:sz w:val="24"/>
+          <w:szCs w:val="24"/>
+        </w:rPr>
+        <w:t>{{</w:t>
+      </w:r>
+      <w:proofErr w:type="spellStart"/>
+      <w:r>
+        <w:rPr>
+          <w:rFonts w:ascii="Arial" w:hAnsi="Arial" w:cs="Arial"/>
+          <w:sz w:val="24"/>
+          <w:szCs w:val="24"/>
+        </w:rPr>
+        <w:t>child.name_</w:t>
+      </w:r>
+      <w:proofErr w:type="gramStart"/>
+      <w:r>
+        <w:rPr>
+          <w:rFonts w:ascii="Arial" w:hAnsi="Arial" w:cs="Arial"/>
+          <w:sz w:val="24"/>
+          <w:szCs w:val="24"/>
+        </w:rPr>
+        <w:t>full</w:t>
+      </w:r>
+      <w:proofErr w:type="spellEnd"/>
+      <w:r>
+        <w:rPr>
+          <w:rFonts w:ascii="Arial" w:hAnsi="Arial" w:cs="Arial"/>
+          <w:sz w:val="24"/>
+          <w:szCs w:val="24"/>
+        </w:rPr>
+        <w:t>(</w:t>
+      </w:r>
+      <w:proofErr w:type="gramEnd"/>
+      <w:r>
+        <w:rPr>
+          <w:rFonts w:ascii="Arial" w:hAnsi="Arial" w:cs="Arial"/>
+          <w:sz w:val="24"/>
+          <w:szCs w:val="24"/>
+        </w:rPr>
+        <w:t>)}}</w:t>
+      </w:r>
+      <w:r>
+        <w:rPr>
+          <w:rFonts w:ascii="Arial" w:hAnsi="Arial" w:cs="Arial"/>
+          <w:sz w:val="24"/>
+          <w:szCs w:val="24"/>
+        </w:rPr>
+        <w:t xml:space="preserve"> </w:t>
+      </w:r>
+      <w:r>
+        <w:rPr>
+          <w:rFonts w:ascii="Arial" w:hAnsi="Arial" w:cs="Arial"/>
+          <w:color w:val="000000" w:themeColor="text1"/>
+          <w:sz w:val="24"/>
+          <w:szCs w:val="24"/>
+        </w:rPr>
+        <w:t xml:space="preserve">which had been ordered on </w:t>
+      </w:r>
+      <w:r>
+        <w:rPr>
+          <w:rFonts w:ascii="Arial" w:hAnsi="Arial" w:cs="Arial"/>
+          <w:color w:val="000000" w:themeColor="text1"/>
+          <w:sz w:val="24"/>
+          <w:szCs w:val="24"/>
+        </w:rPr>
+        <w:t>{{</w:t>
+      </w:r>
+      <w:proofErr w:type="spellStart"/>
+      <w:r>
+        <w:rPr>
+          <w:rFonts w:ascii="Arial" w:hAnsi="Arial" w:cs="Arial"/>
+          <w:color w:val="000000" w:themeColor="text1"/>
+          <w:sz w:val="24"/>
+          <w:szCs w:val="24"/>
+        </w:rPr>
+        <w:t>guardianship_date</w:t>
+      </w:r>
+      <w:proofErr w:type="spellEnd"/>
+      <w:r>
+        <w:rPr>
+          <w:rFonts w:ascii="Arial" w:hAnsi="Arial" w:cs="Arial"/>
+          <w:color w:val="000000" w:themeColor="text1"/>
+          <w:sz w:val="24"/>
+          <w:szCs w:val="24"/>
+        </w:rPr>
+        <w:t xml:space="preserve">}} </w:t>
+      </w:r>
+      <w:r>
+        <w:rPr>
+          <w:rFonts w:ascii="Arial" w:hAnsi="Arial" w:cs="Arial"/>
+          <w:color w:val="000000" w:themeColor="text1"/>
+          <w:sz w:val="24"/>
+          <w:szCs w:val="24"/>
+        </w:rPr>
+        <w:t>is hereby terminated.</w:t>
       </w:r>
     </w:p>
     <w:p>
       <w:pPr>
         <w:rPr>
-          <w:rFonts w:ascii="Times New Roman" w:hAnsi="Times New Roman"/>
+          <w:rFonts w:ascii="Arial" w:hAnsi="Arial" w:cs="Arial"/>
+          <w:color w:val="000000" w:themeColor="text1"/>
+          <w:sz w:val="24"/>
+          <w:szCs w:val="24"/>
+        </w:rPr>
+      </w:pPr>
+      <w:proofErr w:type="gramStart"/>
+      <w:r>
+        <w:rPr>
+          <w:rFonts w:ascii="Arial" w:hAnsi="Arial" w:cs="Arial"/>
+          <w:color w:val="000000" w:themeColor="text1"/>
+          <w:sz w:val="24"/>
+          <w:szCs w:val="24"/>
+        </w:rPr>
+        <w:t xml:space="preserve">2. </w:t>
+      </w:r>
+      <w:r>
+        <w:rPr>
+          <w:rFonts w:ascii="Arial" w:hAnsi="Arial" w:cs="Arial"/>
+          <w:sz w:val="24"/>
+          <w:szCs w:val="24"/>
+        </w:rPr>
+        <w:t>{{</w:t>
+      </w:r>
+      <w:proofErr w:type="spellStart"/>
+      <w:proofErr w:type="gramEnd"/>
+      <w:r>
+        <w:rPr>
+          <w:rFonts w:ascii="Arial" w:hAnsi="Arial" w:cs="Arial"/>
+          <w:sz w:val="24"/>
+          <w:szCs w:val="24"/>
+        </w:rPr>
+        <w:t>other_parties</w:t>
+      </w:r>
+      <w:proofErr w:type="spellEnd"/>
+      <w:r>
+        <w:rPr>
+          <w:rFonts w:ascii="Arial" w:hAnsi="Arial" w:cs="Arial"/>
+          <w:sz w:val="24"/>
+          <w:szCs w:val="24"/>
+        </w:rPr>
+        <w:t>[0].</w:t>
+      </w:r>
+      <w:proofErr w:type="spellStart"/>
+      <w:r>
+        <w:rPr>
+          <w:rFonts w:ascii="Arial" w:hAnsi="Arial" w:cs="Arial"/>
+          <w:sz w:val="24"/>
+          <w:szCs w:val="24"/>
+        </w:rPr>
+        <w:t>name_</w:t>
+      </w:r>
+      <w:proofErr w:type="gramStart"/>
+      <w:r>
+        <w:rPr>
+          <w:rFonts w:ascii="Arial" w:hAnsi="Arial" w:cs="Arial"/>
+          <w:sz w:val="24"/>
+          <w:szCs w:val="24"/>
+        </w:rPr>
+        <w:t>full</w:t>
+      </w:r>
+      <w:proofErr w:type="spellEnd"/>
+      <w:r>
+        <w:rPr>
+          <w:rFonts w:ascii="Arial" w:hAnsi="Arial" w:cs="Arial"/>
+          <w:sz w:val="24"/>
+          <w:szCs w:val="24"/>
+        </w:rPr>
+        <w:t>(</w:t>
+      </w:r>
+      <w:proofErr w:type="gramEnd"/>
+      <w:r>
+        <w:rPr>
+          <w:rFonts w:ascii="Arial" w:hAnsi="Arial" w:cs="Arial"/>
+          <w:sz w:val="24"/>
+          <w:szCs w:val="24"/>
+        </w:rPr>
+        <w:t>)}}</w:t>
+      </w:r>
+      <w:r>
+        <w:rPr>
+          <w:rFonts w:ascii="Arial" w:hAnsi="Arial" w:cs="Arial"/>
+          <w:color w:val="FF0000"/>
+          <w:sz w:val="24"/>
+          <w:szCs w:val="24"/>
+        </w:rPr>
+        <w:t xml:space="preserve"> </w:t>
+      </w:r>
+      <w:proofErr w:type="gramStart"/>
+      <w:r>
+        <w:rPr>
+          <w:rFonts w:ascii="Arial" w:hAnsi="Arial" w:cs="Arial"/>
+          <w:color w:val="000000" w:themeColor="text1"/>
+          <w:sz w:val="24"/>
+          <w:szCs w:val="24"/>
+        </w:rPr>
+        <w:t>is</w:t>
+      </w:r>
+      <w:proofErr w:type="gramEnd"/>
+      <w:r>
+        <w:rPr>
+          <w:rFonts w:ascii="Arial" w:hAnsi="Arial" w:cs="Arial"/>
+          <w:color w:val="000000" w:themeColor="text1"/>
+          <w:sz w:val="24"/>
+          <w:szCs w:val="24"/>
+        </w:rPr>
+        <w:t xml:space="preserve"> discharged from their</w:t>
+      </w:r>
+      <w:r>
+        <w:rPr>
+          <w:rFonts w:ascii="Arial" w:hAnsi="Arial" w:cs="Arial"/>
+          <w:color w:val="FF0000"/>
+          <w:sz w:val="24"/>
+          <w:szCs w:val="24"/>
+        </w:rPr>
+        <w:t xml:space="preserve"> </w:t>
+      </w:r>
+      <w:r>
+        <w:rPr>
+          <w:rFonts w:ascii="Arial" w:hAnsi="Arial" w:cs="Arial"/>
+          <w:color w:val="000000" w:themeColor="text1"/>
+          <w:sz w:val="24"/>
+          <w:szCs w:val="24"/>
+        </w:rPr>
+        <w:t>duties as guardian.</w:t>
+      </w:r>
+    </w:p>
+    <w:p>
+      <w:pPr>
+        <w:rPr>
+          <w:rFonts w:ascii="Arial" w:hAnsi="Arial" w:cs="Arial"/>
+          <w:color w:val="000000" w:themeColor="text1"/>
+          <w:sz w:val="24"/>
+          <w:szCs w:val="24"/>
+        </w:rPr>
+      </w:pPr>
+      <w:r>
+        <w:rPr>
+          <w:rFonts w:ascii="Arial" w:hAnsi="Arial" w:cs="Arial"/>
+          <w:color w:val="000000" w:themeColor="text1"/>
+          <w:sz w:val="24"/>
+          <w:szCs w:val="24"/>
+        </w:rPr>
+        <w:t xml:space="preserve">3. Care and custody of the minor is returned to </w:t>
+      </w:r>
+      <w:r>
+        <w:rPr>
+          <w:rFonts w:ascii="Arial" w:hAnsi="Arial" w:cs="Arial"/>
+          <w:color w:val="000000" w:themeColor="text1"/>
+          <w:sz w:val="24"/>
+          <w:szCs w:val="24"/>
+        </w:rPr>
+        <w:t>{{users[0].</w:t>
+      </w:r>
+      <w:proofErr w:type="spellStart"/>
+      <w:r>
+        <w:rPr>
+          <w:rFonts w:ascii="Arial" w:hAnsi="Arial" w:cs="Arial"/>
+          <w:color w:val="000000" w:themeColor="text1"/>
+          <w:sz w:val="24"/>
+          <w:szCs w:val="24"/>
+        </w:rPr>
+        <w:t>name_</w:t>
+      </w:r>
+      <w:proofErr w:type="gramStart"/>
+      <w:r>
+        <w:rPr>
+          <w:rFonts w:ascii="Arial" w:hAnsi="Arial" w:cs="Arial"/>
+          <w:color w:val="000000" w:themeColor="text1"/>
+          <w:sz w:val="24"/>
+          <w:szCs w:val="24"/>
+        </w:rPr>
+        <w:t>full</w:t>
+      </w:r>
+      <w:proofErr w:type="spellEnd"/>
+      <w:r>
+        <w:rPr>
+          <w:rFonts w:ascii="Arial" w:hAnsi="Arial" w:cs="Arial"/>
+          <w:color w:val="000000" w:themeColor="text1"/>
+          <w:sz w:val="24"/>
+          <w:szCs w:val="24"/>
+        </w:rPr>
+        <w:t>(</w:t>
+      </w:r>
+      <w:proofErr w:type="gramEnd"/>
+      <w:r>
+        <w:rPr>
+          <w:rFonts w:ascii="Arial" w:hAnsi="Arial" w:cs="Arial"/>
+          <w:color w:val="000000" w:themeColor="text1"/>
+          <w:sz w:val="24"/>
+          <w:szCs w:val="24"/>
+        </w:rPr>
+        <w:t>)}}</w:t>
+      </w:r>
+      <w:r>
+        <w:rPr>
+          <w:rFonts w:ascii="Arial" w:hAnsi="Arial" w:cs="Arial"/>
+          <w:color w:val="000000" w:themeColor="text1"/>
+          <w:sz w:val="24"/>
+          <w:szCs w:val="24"/>
+        </w:rPr>
+        <w:t xml:space="preserve">, </w:t>
+      </w:r>
+      <w:r>
+        <w:rPr>
+          <w:rFonts w:ascii="Arial" w:hAnsi="Arial" w:cs="Arial"/>
+          <w:color w:val="000000" w:themeColor="text1"/>
+          <w:sz w:val="24"/>
+          <w:szCs w:val="24"/>
+        </w:rPr>
+        <w:t>parent</w:t>
+      </w:r>
+      <w:r>
+        <w:rPr>
+          <w:rFonts w:ascii="Arial" w:hAnsi="Arial" w:cs="Arial"/>
+          <w:color w:val="000000" w:themeColor="text1"/>
+          <w:sz w:val="24"/>
+          <w:szCs w:val="24"/>
+        </w:rPr>
+        <w:t xml:space="preserve"> of the child.</w:t>
+      </w:r>
+    </w:p>
+    <w:p>
+      <w:pPr>
+        <w:rPr>
+          <w:rFonts w:ascii="Arial" w:hAnsi="Arial" w:cs="Arial"/>
           <w:color w:val="000000" w:themeColor="text1"/>
           <w:sz w:val="24"/>
           <w:szCs w:val="24"/>
@@ -728,18 +1428,48 @@
               <w:pStyle w:val="BodyText"/>
               <w:spacing w:before="2"/>
               <w:rPr>
-                <w:rFonts w:ascii="Times New Roman" w:hAnsi="Times New Roman" w:cs="Times New Roman"/>
-                <w:sz w:val="24"/>
-                <w:szCs w:val="24"/>
-              </w:rPr>
-            </w:pPr>
-            <w:r>
-              <w:rPr>
-                <w:rFonts w:ascii="Times New Roman" w:hAnsi="Times New Roman" w:cs="Times New Roman"/>
-                <w:sz w:val="24"/>
-                <w:szCs w:val="24"/>
-              </w:rPr>
-              <w:t>{{users[0].name_full()}}</w:t>
+                <w:sz w:val="24"/>
+                <w:szCs w:val="24"/>
+              </w:rPr>
+            </w:pPr>
+            <w:r>
+              <w:rPr>
+                <w:sz w:val="24"/>
+                <w:szCs w:val="24"/>
+              </w:rPr>
+              <w:t>{{users[0].</w:t>
+            </w:r>
+            <w:proofErr w:type="spellStart"/>
+            <w:r>
+              <w:rPr>
+                <w:sz w:val="24"/>
+                <w:szCs w:val="24"/>
+              </w:rPr>
+              <w:t>name_</w:t>
+            </w:r>
+            <w:proofErr w:type="gramStart"/>
+            <w:r>
+              <w:rPr>
+                <w:sz w:val="24"/>
+                <w:szCs w:val="24"/>
+              </w:rPr>
+              <w:t>full</w:t>
+            </w:r>
+            <w:proofErr w:type="spellEnd"/>
+            <w:r>
+              <w:rPr>
+                <w:sz w:val="24"/>
+                <w:szCs w:val="24"/>
+              </w:rPr>
+              <w:t>(</w:t>
+            </w:r>
+            <w:proofErr w:type="gramEnd"/>
+            <w:r>
+              <w:rPr>
+                <w:sz w:val="24"/>
+                <w:szCs w:val="24"/>
+              </w:rPr>
+              <w:t>)}}</w:t>
             </w:r>
           </w:p>
         </w:tc>
@@ -758,7 +1488,6 @@
               <w:pStyle w:val="BodyText"/>
               <w:spacing w:before="2"/>
               <w:rPr>
-                <w:rFonts w:ascii="Times New Roman" w:hAnsi="Times New Roman" w:cs="Times New Roman"/>
                 <w:sz w:val="24"/>
                 <w:szCs w:val="24"/>
               </w:rPr>
@@ -780,7 +1509,6 @@
               <w:pStyle w:val="BodyText"/>
               <w:spacing w:before="2"/>
               <w:rPr>
-                <w:rFonts w:ascii="Times New Roman" w:hAnsi="Times New Roman" w:cs="Times New Roman"/>
                 <w:sz w:val="24"/>
                 <w:szCs w:val="24"/>
               </w:rPr>
@@ -804,14 +1532,12 @@
               <w:pStyle w:val="BodyText"/>
               <w:spacing w:before="2"/>
               <w:rPr>
-                <w:rFonts w:ascii="Times New Roman" w:hAnsi="Times New Roman" w:cs="Times New Roman"/>
-                <w:sz w:val="24"/>
-                <w:szCs w:val="24"/>
-              </w:rPr>
-            </w:pPr>
-            <w:r>
-              <w:rPr>
-                <w:rFonts w:ascii="Times New Roman" w:hAnsi="Times New Roman" w:cs="Times New Roman"/>
+                <w:sz w:val="24"/>
+                <w:szCs w:val="24"/>
+              </w:rPr>
+            </w:pPr>
+            <w:r>
+              <w:rPr>
                 <w:sz w:val="24"/>
                 <w:szCs w:val="24"/>
               </w:rPr>
@@ -834,7 +1560,6 @@
               <w:pStyle w:val="BodyText"/>
               <w:spacing w:before="2"/>
               <w:rPr>
-                <w:rFonts w:ascii="Times New Roman" w:hAnsi="Times New Roman" w:cs="Times New Roman"/>
                 <w:sz w:val="24"/>
                 <w:szCs w:val="24"/>
               </w:rPr>
@@ -856,7 +1581,6 @@
               <w:pStyle w:val="BodyText"/>
               <w:spacing w:before="2"/>
               <w:rPr>
-                <w:rFonts w:ascii="Times New Roman" w:hAnsi="Times New Roman" w:cs="Times New Roman"/>
                 <w:sz w:val="24"/>
                 <w:szCs w:val="24"/>
               </w:rPr>
@@ -880,7 +1604,6 @@
               <w:pStyle w:val="BodyText"/>
               <w:spacing w:before="2"/>
               <w:rPr>
-                <w:rFonts w:ascii="Times New Roman" w:hAnsi="Times New Roman" w:cs="Times New Roman"/>
                 <w:sz w:val="24"/>
                 <w:szCs w:val="24"/>
               </w:rPr>
@@ -902,7 +1625,6 @@
               <w:pStyle w:val="BodyText"/>
               <w:spacing w:before="2"/>
               <w:rPr>
-                <w:rFonts w:ascii="Times New Roman" w:hAnsi="Times New Roman" w:cs="Times New Roman"/>
                 <w:sz w:val="24"/>
                 <w:szCs w:val="24"/>
               </w:rPr>
@@ -924,14 +1646,12 @@
               <w:pStyle w:val="BodyText"/>
               <w:spacing w:before="2"/>
               <w:rPr>
-                <w:rFonts w:ascii="Times New Roman" w:hAnsi="Times New Roman" w:cs="Times New Roman"/>
-                <w:sz w:val="24"/>
-                <w:szCs w:val="24"/>
-              </w:rPr>
-            </w:pPr>
-            <w:r>
-              <w:rPr>
-                <w:rFonts w:ascii="Times New Roman" w:hAnsi="Times New Roman" w:cs="Times New Roman"/>
+                <w:sz w:val="24"/>
+                <w:szCs w:val="24"/>
+              </w:rPr>
+            </w:pPr>
+            <w:r>
+              <w:rPr>
                 <w:sz w:val="24"/>
                 <w:szCs w:val="24"/>
               </w:rPr>
@@ -956,18 +1676,48 @@
               <w:pStyle w:val="BodyText"/>
               <w:spacing w:before="2"/>
               <w:rPr>
-                <w:rFonts w:ascii="Times New Roman" w:hAnsi="Times New Roman" w:cs="Times New Roman"/>
-                <w:sz w:val="24"/>
-                <w:szCs w:val="24"/>
-              </w:rPr>
-            </w:pPr>
-            <w:r>
-              <w:rPr>
-                <w:rFonts w:ascii="Times New Roman" w:hAnsi="Times New Roman" w:cs="Times New Roman"/>
-                <w:sz w:val="24"/>
-                <w:szCs w:val="24"/>
-              </w:rPr>
-              <w:t>{{users[0].address.on_one_line(bare=True)}}</w:t>
+                <w:sz w:val="24"/>
+                <w:szCs w:val="24"/>
+              </w:rPr>
+            </w:pPr>
+            <w:r>
+              <w:rPr>
+                <w:sz w:val="24"/>
+                <w:szCs w:val="24"/>
+              </w:rPr>
+              <w:t>{{users[0</w:t>
+            </w:r>
+            <w:proofErr w:type="gramStart"/>
+            <w:r>
+              <w:rPr>
+                <w:sz w:val="24"/>
+                <w:szCs w:val="24"/>
+              </w:rPr>
+              <w:t>].</w:t>
+            </w:r>
+            <w:proofErr w:type="spellStart"/>
+            <w:r>
+              <w:rPr>
+                <w:sz w:val="24"/>
+                <w:szCs w:val="24"/>
+              </w:rPr>
+              <w:t>address</w:t>
+            </w:r>
+            <w:proofErr w:type="gramEnd"/>
+            <w:r>
+              <w:rPr>
+                <w:sz w:val="24"/>
+                <w:szCs w:val="24"/>
+              </w:rPr>
+              <w:t>.on_one_line</w:t>
+            </w:r>
+            <w:proofErr w:type="spellEnd"/>
+            <w:r>
+              <w:rPr>
+                <w:sz w:val="24"/>
+                <w:szCs w:val="24"/>
+              </w:rPr>
+              <w:t>(bare=True)}}</w:t>
             </w:r>
           </w:p>
         </w:tc>
@@ -986,7 +1736,6 @@
               <w:pStyle w:val="BodyText"/>
               <w:spacing w:before="2"/>
               <w:rPr>
-                <w:rFonts w:ascii="Times New Roman" w:hAnsi="Times New Roman" w:cs="Times New Roman"/>
                 <w:sz w:val="24"/>
                 <w:szCs w:val="24"/>
               </w:rPr>
@@ -1008,7 +1757,6 @@
               <w:pStyle w:val="BodyText"/>
               <w:spacing w:before="2"/>
               <w:rPr>
-                <w:rFonts w:ascii="Times New Roman" w:hAnsi="Times New Roman" w:cs="Times New Roman"/>
                 <w:sz w:val="24"/>
                 <w:szCs w:val="24"/>
               </w:rPr>
@@ -1032,14 +1780,12 @@
               <w:pStyle w:val="BodyText"/>
               <w:spacing w:before="2"/>
               <w:rPr>
-                <w:rFonts w:ascii="Times New Roman" w:hAnsi="Times New Roman" w:cs="Times New Roman"/>
-                <w:sz w:val="24"/>
-                <w:szCs w:val="24"/>
-              </w:rPr>
-            </w:pPr>
-            <w:r>
-              <w:rPr>
-                <w:rFonts w:ascii="Times New Roman" w:hAnsi="Times New Roman" w:cs="Times New Roman"/>
+                <w:sz w:val="24"/>
+                <w:szCs w:val="24"/>
+              </w:rPr>
+            </w:pPr>
+            <w:r>
+              <w:rPr>
                 <w:sz w:val="24"/>
                 <w:szCs w:val="24"/>
               </w:rPr>
@@ -1062,7 +1808,6 @@
               <w:pStyle w:val="BodyText"/>
               <w:spacing w:before="2"/>
               <w:rPr>
-                <w:rFonts w:ascii="Times New Roman" w:hAnsi="Times New Roman" w:cs="Times New Roman"/>
                 <w:sz w:val="24"/>
                 <w:szCs w:val="24"/>
               </w:rPr>
@@ -1084,7 +1829,6 @@
               <w:pStyle w:val="BodyText"/>
               <w:spacing w:before="2"/>
               <w:rPr>
-                <w:rFonts w:ascii="Times New Roman" w:hAnsi="Times New Roman" w:cs="Times New Roman"/>
                 <w:sz w:val="24"/>
                 <w:szCs w:val="24"/>
               </w:rPr>
@@ -1108,7 +1852,6 @@
               <w:pStyle w:val="BodyText"/>
               <w:spacing w:before="2"/>
               <w:rPr>
-                <w:rFonts w:ascii="Times New Roman" w:hAnsi="Times New Roman" w:cs="Times New Roman"/>
                 <w:sz w:val="24"/>
                 <w:szCs w:val="24"/>
               </w:rPr>
@@ -1130,7 +1873,6 @@
               <w:pStyle w:val="BodyText"/>
               <w:spacing w:before="2"/>
               <w:rPr>
-                <w:rFonts w:ascii="Times New Roman" w:hAnsi="Times New Roman" w:cs="Times New Roman"/>
                 <w:sz w:val="24"/>
                 <w:szCs w:val="24"/>
               </w:rPr>
@@ -1152,14 +1894,12 @@
               <w:pStyle w:val="BodyText"/>
               <w:spacing w:before="2"/>
               <w:rPr>
-                <w:rFonts w:ascii="Times New Roman" w:hAnsi="Times New Roman" w:cs="Times New Roman"/>
-                <w:sz w:val="24"/>
-                <w:szCs w:val="24"/>
-              </w:rPr>
-            </w:pPr>
-            <w:r>
-              <w:rPr>
-                <w:rFonts w:ascii="Times New Roman" w:hAnsi="Times New Roman" w:cs="Times New Roman"/>
+                <w:sz w:val="24"/>
+                <w:szCs w:val="24"/>
+              </w:rPr>
+            </w:pPr>
+            <w:r>
+              <w:rPr>
                 <w:sz w:val="24"/>
                 <w:szCs w:val="24"/>
               </w:rPr>
@@ -1184,18 +1924,160 @@
               <w:pStyle w:val="BodyText"/>
               <w:spacing w:before="2"/>
               <w:rPr>
-                <w:rFonts w:ascii="Times New Roman" w:hAnsi="Times New Roman" w:cs="Times New Roman"/>
-                <w:sz w:val="24"/>
-                <w:szCs w:val="24"/>
-              </w:rPr>
-            </w:pPr>
-            <w:r>
-              <w:rPr>
-                <w:rFonts w:ascii="Times New Roman" w:hAnsi="Times New Roman" w:cs="Times New Roman"/>
-                <w:sz w:val="24"/>
-                <w:szCs w:val="24"/>
-              </w:rPr>
-              <w:t>{% if users[0].phone_number != “” %}{{phone_number_formatted(users[0].phone_number)}}{% endif %}</w:t>
+                <w:sz w:val="24"/>
+                <w:szCs w:val="24"/>
+              </w:rPr>
+            </w:pPr>
+            <w:r>
+              <w:rPr>
+                <w:sz w:val="24"/>
+                <w:szCs w:val="24"/>
+              </w:rPr>
+              <w:t xml:space="preserve">{% if </w:t>
+            </w:r>
+            <w:proofErr w:type="gramStart"/>
+            <w:r>
+              <w:rPr>
+                <w:sz w:val="24"/>
+                <w:szCs w:val="24"/>
+              </w:rPr>
+              <w:t>users[</w:t>
+            </w:r>
+            <w:proofErr w:type="gramEnd"/>
+            <w:r>
+              <w:rPr>
+                <w:sz w:val="24"/>
+                <w:szCs w:val="24"/>
+              </w:rPr>
+              <w:t>0</w:t>
+            </w:r>
+            <w:proofErr w:type="gramStart"/>
+            <w:r>
+              <w:rPr>
+                <w:sz w:val="24"/>
+                <w:szCs w:val="24"/>
+              </w:rPr>
+              <w:t>].</w:t>
+            </w:r>
+            <w:proofErr w:type="spellStart"/>
+            <w:r>
+              <w:rPr>
+                <w:sz w:val="24"/>
+                <w:szCs w:val="24"/>
+              </w:rPr>
+              <w:t>phone</w:t>
+            </w:r>
+            <w:proofErr w:type="gramEnd"/>
+            <w:r>
+              <w:rPr>
+                <w:sz w:val="24"/>
+                <w:szCs w:val="24"/>
+              </w:rPr>
+              <w:t>_</w:t>
+            </w:r>
+            <w:proofErr w:type="gramStart"/>
+            <w:r>
+              <w:rPr>
+                <w:sz w:val="24"/>
+                <w:szCs w:val="24"/>
+              </w:rPr>
+              <w:t>number</w:t>
+            </w:r>
+            <w:proofErr w:type="spellEnd"/>
+            <w:r>
+              <w:rPr>
+                <w:sz w:val="24"/>
+                <w:szCs w:val="24"/>
+              </w:rPr>
+              <w:t xml:space="preserve"> !</w:t>
+            </w:r>
+            <w:proofErr w:type="gramEnd"/>
+            <w:r>
+              <w:rPr>
+                <w:sz w:val="24"/>
+                <w:szCs w:val="24"/>
+              </w:rPr>
+              <w:t xml:space="preserve">= “” </w:t>
+            </w:r>
+            <w:proofErr w:type="gramStart"/>
+            <w:r>
+              <w:rPr>
+                <w:sz w:val="24"/>
+                <w:szCs w:val="24"/>
+              </w:rPr>
+              <w:t>%}{</w:t>
+            </w:r>
+            <w:proofErr w:type="gramEnd"/>
+            <w:r>
+              <w:rPr>
+                <w:sz w:val="24"/>
+                <w:szCs w:val="24"/>
+              </w:rPr>
+              <w:t>{</w:t>
+            </w:r>
+            <w:proofErr w:type="spellStart"/>
+            <w:r>
+              <w:rPr>
+                <w:sz w:val="24"/>
+                <w:szCs w:val="24"/>
+              </w:rPr>
+              <w:t>phone_number_formatted</w:t>
+            </w:r>
+            <w:proofErr w:type="spellEnd"/>
+            <w:r>
+              <w:rPr>
+                <w:sz w:val="24"/>
+                <w:szCs w:val="24"/>
+              </w:rPr>
+              <w:t>(users[0</w:t>
+            </w:r>
+            <w:proofErr w:type="gramStart"/>
+            <w:r>
+              <w:rPr>
+                <w:sz w:val="24"/>
+                <w:szCs w:val="24"/>
+              </w:rPr>
+              <w:t>].</w:t>
+            </w:r>
+            <w:proofErr w:type="spellStart"/>
+            <w:r>
+              <w:rPr>
+                <w:sz w:val="24"/>
+                <w:szCs w:val="24"/>
+              </w:rPr>
+              <w:t>phone</w:t>
+            </w:r>
+            <w:proofErr w:type="gramEnd"/>
+            <w:r>
+              <w:rPr>
+                <w:sz w:val="24"/>
+                <w:szCs w:val="24"/>
+              </w:rPr>
+              <w:t>_number</w:t>
+            </w:r>
+            <w:proofErr w:type="spellEnd"/>
+            <w:r>
+              <w:rPr>
+                <w:sz w:val="24"/>
+                <w:szCs w:val="24"/>
+              </w:rPr>
+              <w:t>)</w:t>
+            </w:r>
+            <w:proofErr w:type="gramStart"/>
+            <w:r>
+              <w:rPr>
+                <w:sz w:val="24"/>
+                <w:szCs w:val="24"/>
+              </w:rPr>
+              <w:t>}}{</w:t>
+            </w:r>
+            <w:proofErr w:type="gramEnd"/>
+            <w:r>
+              <w:rPr>
+                <w:sz w:val="24"/>
+                <w:szCs w:val="24"/>
+              </w:rPr>
+              <w:t>% endif %}</w:t>
             </w:r>
           </w:p>
         </w:tc>
@@ -1214,7 +2096,6 @@
               <w:pStyle w:val="BodyText"/>
               <w:spacing w:before="2"/>
               <w:rPr>
-                <w:rFonts w:ascii="Times New Roman" w:hAnsi="Times New Roman" w:cs="Times New Roman"/>
                 <w:sz w:val="24"/>
                 <w:szCs w:val="24"/>
               </w:rPr>
@@ -1236,7 +2117,6 @@
               <w:pStyle w:val="BodyText"/>
               <w:spacing w:before="2"/>
               <w:rPr>
-                <w:rFonts w:ascii="Times New Roman" w:hAnsi="Times New Roman" w:cs="Times New Roman"/>
                 <w:sz w:val="24"/>
                 <w:szCs w:val="24"/>
               </w:rPr>
@@ -1260,14 +2140,12 @@
               <w:pStyle w:val="BodyText"/>
               <w:spacing w:before="2"/>
               <w:rPr>
-                <w:rFonts w:ascii="Times New Roman" w:hAnsi="Times New Roman" w:cs="Times New Roman"/>
-                <w:sz w:val="24"/>
-                <w:szCs w:val="24"/>
-              </w:rPr>
-            </w:pPr>
-            <w:r>
-              <w:rPr>
-                <w:rFonts w:ascii="Times New Roman" w:hAnsi="Times New Roman" w:cs="Times New Roman"/>
+                <w:sz w:val="24"/>
+                <w:szCs w:val="24"/>
+              </w:rPr>
+            </w:pPr>
+            <w:r>
+              <w:rPr>
                 <w:sz w:val="24"/>
                 <w:szCs w:val="24"/>
               </w:rPr>
@@ -1290,7 +2168,6 @@
               <w:pStyle w:val="BodyText"/>
               <w:spacing w:before="2"/>
               <w:rPr>
-                <w:rFonts w:ascii="Times New Roman" w:hAnsi="Times New Roman" w:cs="Times New Roman"/>
                 <w:sz w:val="24"/>
                 <w:szCs w:val="24"/>
               </w:rPr>
@@ -1312,7 +2189,6 @@
               <w:pStyle w:val="BodyText"/>
               <w:spacing w:before="2"/>
               <w:rPr>
-                <w:rFonts w:ascii="Times New Roman" w:hAnsi="Times New Roman" w:cs="Times New Roman"/>
                 <w:sz w:val="24"/>
                 <w:szCs w:val="24"/>
               </w:rPr>
@@ -1336,7 +2212,6 @@
               <w:pStyle w:val="BodyText"/>
               <w:spacing w:before="2"/>
               <w:rPr>
-                <w:rFonts w:ascii="Times New Roman" w:hAnsi="Times New Roman" w:cs="Times New Roman"/>
                 <w:sz w:val="24"/>
                 <w:szCs w:val="24"/>
               </w:rPr>
@@ -1358,7 +2233,6 @@
               <w:pStyle w:val="BodyText"/>
               <w:spacing w:before="2"/>
               <w:rPr>
-                <w:rFonts w:ascii="Times New Roman" w:hAnsi="Times New Roman" w:cs="Times New Roman"/>
                 <w:sz w:val="24"/>
                 <w:szCs w:val="24"/>
               </w:rPr>
@@ -1380,14 +2254,12 @@
               <w:pStyle w:val="BodyText"/>
               <w:spacing w:before="2"/>
               <w:rPr>
-                <w:rFonts w:ascii="Times New Roman" w:hAnsi="Times New Roman" w:cs="Times New Roman"/>
-                <w:sz w:val="24"/>
-                <w:szCs w:val="24"/>
-              </w:rPr>
-            </w:pPr>
-            <w:r>
-              <w:rPr>
-                <w:rFonts w:ascii="Times New Roman" w:hAnsi="Times New Roman" w:cs="Times New Roman"/>
+                <w:sz w:val="24"/>
+                <w:szCs w:val="24"/>
+              </w:rPr>
+            </w:pPr>
+            <w:r>
+              <w:rPr>
                 <w:sz w:val="24"/>
                 <w:szCs w:val="24"/>
               </w:rPr>
@@ -1412,18 +2284,96 @@
               <w:pStyle w:val="BodyText"/>
               <w:spacing w:before="2"/>
               <w:rPr>
-                <w:rFonts w:ascii="Times New Roman" w:hAnsi="Times New Roman" w:cs="Times New Roman"/>
-                <w:sz w:val="24"/>
-                <w:szCs w:val="24"/>
-              </w:rPr>
-            </w:pPr>
-            <w:r>
-              <w:rPr>
-                <w:rFonts w:ascii="Times New Roman" w:hAnsi="Times New Roman" w:cs="Times New Roman"/>
-                <w:sz w:val="24"/>
-                <w:szCs w:val="24"/>
-              </w:rPr>
-              <w:t>{% if users[0].has_email_address %}{{users[0].email}}{% endif %}</w:t>
+                <w:sz w:val="24"/>
+                <w:szCs w:val="24"/>
+              </w:rPr>
+            </w:pPr>
+            <w:r>
+              <w:rPr>
+                <w:sz w:val="24"/>
+                <w:szCs w:val="24"/>
+              </w:rPr>
+              <w:t xml:space="preserve">{% if </w:t>
+            </w:r>
+            <w:proofErr w:type="gramStart"/>
+            <w:r>
+              <w:rPr>
+                <w:sz w:val="24"/>
+                <w:szCs w:val="24"/>
+              </w:rPr>
+              <w:t>users[</w:t>
+            </w:r>
+            <w:proofErr w:type="gramEnd"/>
+            <w:r>
+              <w:rPr>
+                <w:sz w:val="24"/>
+                <w:szCs w:val="24"/>
+              </w:rPr>
+              <w:t>0</w:t>
+            </w:r>
+            <w:proofErr w:type="gramStart"/>
+            <w:r>
+              <w:rPr>
+                <w:sz w:val="24"/>
+                <w:szCs w:val="24"/>
+              </w:rPr>
+              <w:t>].</w:t>
+            </w:r>
+            <w:proofErr w:type="spellStart"/>
+            <w:r>
+              <w:rPr>
+                <w:sz w:val="24"/>
+                <w:szCs w:val="24"/>
+              </w:rPr>
+              <w:t>has</w:t>
+            </w:r>
+            <w:proofErr w:type="gramEnd"/>
+            <w:r>
+              <w:rPr>
+                <w:sz w:val="24"/>
+                <w:szCs w:val="24"/>
+              </w:rPr>
+              <w:t>_email_address</w:t>
+            </w:r>
+            <w:proofErr w:type="spellEnd"/>
+            <w:r>
+              <w:rPr>
+                <w:sz w:val="24"/>
+                <w:szCs w:val="24"/>
+              </w:rPr>
+              <w:t xml:space="preserve"> </w:t>
+            </w:r>
+            <w:proofErr w:type="gramStart"/>
+            <w:r>
+              <w:rPr>
+                <w:sz w:val="24"/>
+                <w:szCs w:val="24"/>
+              </w:rPr>
+              <w:t>%}{</w:t>
+            </w:r>
+            <w:proofErr w:type="gramEnd"/>
+            <w:r>
+              <w:rPr>
+                <w:sz w:val="24"/>
+                <w:szCs w:val="24"/>
+              </w:rPr>
+              <w:t>{users[0</w:t>
+            </w:r>
+            <w:proofErr w:type="gramStart"/>
+            <w:r>
+              <w:rPr>
+                <w:sz w:val="24"/>
+                <w:szCs w:val="24"/>
+              </w:rPr>
+              <w:t>].email}}{</w:t>
+            </w:r>
+            <w:proofErr w:type="gramEnd"/>
+            <w:r>
+              <w:rPr>
+                <w:sz w:val="24"/>
+                <w:szCs w:val="24"/>
+              </w:rPr>
+              <w:t>% endif %}</w:t>
             </w:r>
           </w:p>
         </w:tc>
@@ -1442,7 +2392,6 @@
               <w:pStyle w:val="BodyText"/>
               <w:spacing w:before="2"/>
               <w:rPr>
-                <w:rFonts w:ascii="Times New Roman" w:hAnsi="Times New Roman" w:cs="Times New Roman"/>
                 <w:sz w:val="24"/>
                 <w:szCs w:val="24"/>
               </w:rPr>
@@ -1464,7 +2413,6 @@
               <w:pStyle w:val="BodyText"/>
               <w:spacing w:before="2"/>
               <w:rPr>
-                <w:rFonts w:ascii="Times New Roman" w:hAnsi="Times New Roman" w:cs="Times New Roman"/>
                 <w:sz w:val="24"/>
                 <w:szCs w:val="24"/>
               </w:rPr>
@@ -1488,14 +2436,12 @@
               <w:pStyle w:val="BodyText"/>
               <w:spacing w:before="2"/>
               <w:rPr>
-                <w:rFonts w:ascii="Times New Roman" w:hAnsi="Times New Roman" w:cs="Times New Roman"/>
-                <w:sz w:val="24"/>
-                <w:szCs w:val="24"/>
-              </w:rPr>
-            </w:pPr>
-            <w:r>
-              <w:rPr>
-                <w:rFonts w:ascii="Times New Roman" w:hAnsi="Times New Roman" w:cs="Times New Roman"/>
+                <w:sz w:val="24"/>
+                <w:szCs w:val="24"/>
+              </w:rPr>
+            </w:pPr>
+            <w:r>
+              <w:rPr>
                 <w:sz w:val="24"/>
                 <w:szCs w:val="24"/>
               </w:rPr>
@@ -1518,7 +2464,6 @@
               <w:pStyle w:val="BodyText"/>
               <w:spacing w:before="2"/>
               <w:rPr>
-                <w:rFonts w:ascii="Times New Roman" w:hAnsi="Times New Roman" w:cs="Times New Roman"/>
                 <w:sz w:val="24"/>
                 <w:szCs w:val="24"/>
               </w:rPr>
@@ -1540,7 +2485,6 @@
               <w:pStyle w:val="BodyText"/>
               <w:spacing w:before="2"/>
               <w:rPr>
-                <w:rFonts w:ascii="Times New Roman" w:hAnsi="Times New Roman" w:cs="Times New Roman"/>
                 <w:sz w:val="24"/>
                 <w:szCs w:val="24"/>
               </w:rPr>
@@ -1552,7 +2496,9 @@
     <w:p>
       <w:pPr>
         <w:rPr>
-          <w:rFonts w:ascii="Times New Roman" w:hAnsi="Times New Roman"/>
+          <w:rFonts w:ascii="Arial" w:hAnsi="Arial" w:cs="Arial"/>
+          <w:sz w:val="24"/>
+          <w:szCs w:val="24"/>
         </w:rPr>
       </w:pPr>
     </w:p>

</xml_diff>

<commit_message>
Implemented May 26 2026 feedback
</commit_message>
<xml_diff>
--- a/docassemble/MinorGuardianshipDischarge/data/templates/guardianship_discharge_order.docx
+++ b/docassemble/MinorGuardianshipDischarge/data/templates/guardianship_discharge_order.docx
@@ -237,6 +237,15 @@
                 <w:szCs w:val="24"/>
               </w:rPr>
             </w:pPr>
+            <w:r>
+              <w:rPr>
+                <w:rFonts w:ascii="Arial" w:hAnsi="Arial" w:cs="Arial"/>
+                <w:color w:val="000000"/>
+                <w:sz w:val="24"/>
+                <w:szCs w:val="24"/>
+              </w:rPr>
+              <w:t>CASE NUMBER:</w:t>
+            </w:r>
           </w:p>
         </w:tc>
         <w:tc>
@@ -415,7 +424,7 @@
                 <w:sz w:val="24"/>
                 <w:szCs w:val="24"/>
               </w:rPr>
-              <w:t xml:space="preserve">NO. {% if </w:t>
+              <w:t xml:space="preserve">{% if </w:t>
             </w:r>
             <w:proofErr w:type="spellStart"/>
             <w:r>
@@ -465,7 +474,16 @@
                 <w:sz w:val="24"/>
                 <w:szCs w:val="24"/>
               </w:rPr>
-              <w:t>%}{</w:t>
+              <w:t>%}</w:t>
+            </w:r>
+            <w:r>
+              <w:rPr>
+                <w:rFonts w:ascii="Arial" w:hAnsi="Arial" w:cs="Arial"/>
+                <w:color w:val="000000"/>
+                <w:sz w:val="24"/>
+                <w:szCs w:val="24"/>
+              </w:rPr>
+              <w:t>{</w:t>
             </w:r>
             <w:proofErr w:type="gramEnd"/>
             <w:r>

</xml_diff>